<commit_message>
fig and table cap edits
</commit_message>
<xml_diff>
--- a/manu-draft.docx
+++ b/manu-draft.docx
@@ -517,7 +517,7 @@
               <w:pStyle w:val="ImageCaption"/>
             </w:pPr>
             <w:r>
-              <w:t xml:space="preserve">Fig. 2: Comparison of raw deviations (top row) and scores (bottom row) for each of three metrics to actual estimates following a leave-one-site-out analysis across all years. The values on the x-axis represent the newly calculated raw deviations or scores after removing one site for each of all sampling years, repeated until each site was removed once. The</w:t>
+              <w:t xml:space="preserve">Fig. 2: Comparison of raw deviations (top row) and scores (bottom row) for each of three metrics following a leave-one-site-out analysis across all years. The values on the y-axis represent the newly calculated raw deviations or scores after removing one site for each of all sampling years, repeated until each site was removed once. The x-axis shows the original full-sample value for comparison. Points are colored by year. The</w:t>
             </w:r>
             <w:r>
               <w:t xml:space="preserve"> </w:t>
@@ -531,7 +531,7 @@
               <w:t xml:space="preserve"> </w:t>
             </w:r>
             <w:r>
-              <w:t xml:space="preserve">values represent the correlations of the recalculated values after removing one site and the full values with all sites. The dotted lines are 1:1 relationships.</w:t>
+              <w:t xml:space="preserve">values represent the correlations between the recalculated values after removing one site and the full values with all sites. The dashed lines are 1:1 relationships.</w:t>
             </w:r>
           </w:p>
           <w:bookmarkEnd w:id="36"/>
@@ -615,7 +615,7 @@
               <w:pStyle w:val="ImageCaption"/>
             </w:pPr>
             <w:r>
-              <w:t xml:space="preserve">Fig. 3: Sensitivity of the calculated floor for the metric scores based on length of the calibration period. Different calibration periods of two to six years from the beginning of the period of record were evaluated. The black line is the mean floor for each year and metric. Score floors are jittered on the x-axis by year.</w:t>
+              <w:t xml:space="preserve">Fig. 3: Sensitivity of the calculated floor for the metric scores based on length of the calibration period. Different calibration periods of two to six years from the beginning of the period of record were evaluated and are shown by point color. The black line is the mean floor across calibration periods for each year and metric. Points are jittered on the x-axis within each year.</w:t>
             </w:r>
           </w:p>
           <w:bookmarkEnd w:id="40"/>
@@ -699,7 +699,7 @@
               <w:pStyle w:val="ImageCaption"/>
             </w:pPr>
             <w:r>
-              <w:t xml:space="preserve">Fig. 4: Results of mixed-effects models comparing group scores (top row) and absolute deviations (bottom row) over time. The models in the top row evaluate scores as a function of time with a random group effect, whereas the models in the bottom row evaluate the absolute deviations of the group values from the between group means with random effects for species and group. Solid lines show the overall group or group/species means and the dashed lines show individual effects for group or group/species. The bottom right plot did not have significant species or group effects and only the fit of absolute deviation over time is shown. None of the relationships are significant (ns: not significant).</w:t>
+              <w:t xml:space="preserve">Fig. 4: Results of mixed-effects models comparing group scores (top row) and absolute deviations (bottom row) over time. The models in the top row evaluate scores as a function of time with a random group effect, whereas the models in the bottom row evaluate the absolute deviation of each group’s reported value from the cross-group consensus (true) value, with random effects for species and group. Solid lines show the overall group or group/species means and the dashed lines show individual effects for group or group by species combinations. The bottom right plot (Short Shoot Density) is a singular fit with both species and group random-intercept variances estimated as zero, so only the fixed-effect trend is shown. None of the relationships are significant (ns: not significant).</w:t>
             </w:r>
           </w:p>
           <w:bookmarkEnd w:id="44"/>
@@ -1956,7 +1956,7 @@
               <w:pStyle w:val="ImageCaption"/>
             </w:pPr>
             <w:r>
-              <w:t xml:space="preserve">Table 2: Model summaries of absolute deviation trends over time (year) by metric, with species and group as crossed random intercepts. Units are specific to the metric (Abundance: category positions, Blade Length: cm, Short Shoot Density: percent difference).Group SD is the between group standard deviation and species SD is the between species standard deviation. R² is shown for the marginal (fixed effects only) and conditional (fixed and random) effects. Short Shoot Density is a singular fit (both random-intercept variances estimated as zero), so its conditional R² is undefined. AIC: Akaike Information Criterion.</w:t>
+              <w:t xml:space="preserve">Table 2: Model summaries of absolute deviation trends over time (year) by metric, with species and group as crossed random intercepts. Units are specific to the metric (Abundance: category positions, Blade Length: cm, Short Shoot Density: percent difference). Group SD is the between group standard deviation and species SD is the between species standard deviation. R² is shown for the marginal (fixed effects only) and conditional (fixed and random) effects. Short Shoot Density is a singular fit (both random-intercept variances estimated as zero), so its conditional R² is undefined. AIC: Akaike Information Criterion.</w:t>
             </w:r>
           </w:p>
           <w:tbl xmlns:w="http://schemas.openxmlformats.org/wordprocessingml/2006/main" xmlns:r="http://schemas.openxmlformats.org/officeDocument/2006/relationships" xmlns:w14="http://schemas.microsoft.com/office/word/2010/wordml" xmlns:wp="http://schemas.openxmlformats.org/drawingml/2006/wordprocessingDrawing" xmlns:a="http://schemas.openxmlformats.org/drawingml/2006/main" xmlns:pic="http://schemas.openxmlformats.org/drawingml/2006/picture">
@@ -3601,7 +3601,7 @@
               <w:pStyle w:val="ImageCaption"/>
             </w:pPr>
             <w:r>
-              <w:t xml:space="preserve">Table 3: Slopes of change over time (year) for raw absolute deviations of metrics, by species and training group (A-F). Colors diverge at zero within each metric (red increasing, green decreasing), with the domain scaled separately per metric since the units differ (Abundance: category positions, Blade Length: cm, Short Shoot Density: percent difference).</w:t>
+              <w:t xml:space="preserve">Table 3: Slopes of change over time (year) for raw absolute deviations of metrics, by species and training group (identities anonymized as A-F). Colors diverge at zero within each metric (red increasing, green decreasing), with the domain scaled separately per metric since the units differ (Abundance: category positions, Blade Length: cm, Short Shoot Density: percent difference).</w:t>
             </w:r>
           </w:p>
           <w:tbl xmlns:w="http://schemas.openxmlformats.org/wordprocessingml/2006/main" xmlns:r="http://schemas.openxmlformats.org/officeDocument/2006/relationships" xmlns:w14="http://schemas.microsoft.com/office/word/2010/wordml" xmlns:wp="http://schemas.openxmlformats.org/drawingml/2006/wordprocessingDrawing" xmlns:a="http://schemas.openxmlformats.org/drawingml/2006/main" xmlns:pic="http://schemas.openxmlformats.org/drawingml/2006/picture">

</xml_diff>

<commit_message>
started scoring methods text
</commit_message>
<xml_diff>
--- a/manu-draft.docx
+++ b/manu-draft.docx
@@ -229,7 +229,7 @@
       </w:r>
     </w:p>
     <w:bookmarkEnd w:id="25"/>
-    <w:bookmarkStart w:id="26" w:name="methods"/>
+    <w:bookmarkStart w:id="31" w:name="methods"/>
     <w:p>
       <w:pPr>
         <w:pStyle w:val="Heading2"/>
@@ -246,12 +246,181 @@
         <w:t xml:space="preserve">history of transect monitoring</w:t>
       </w:r>
     </w:p>
+    <w:bookmarkStart w:id="29" w:name="scoring"/>
+    <w:p>
+      <w:pPr>
+        <w:pStyle w:val="Heading3"/>
+      </w:pPr>
+      <w:r>
+        <w:t xml:space="preserve">2.1 Scoring</w:t>
+      </w:r>
+    </w:p>
+    <w:p>
+      <w:pPr>
+        <w:pStyle w:val="FirstParagraph"/>
+      </w:pPr>
+      <w:r>
+        <w:t xml:space="preserve">The scoring method was developed to compare consistency among groups that participated in the training each year, i.e., how closely a group’s results compared to the overall group mean in a given year. No single external ground truth exists, so precision was used as the basis of scoring. Additionally, the species list for a given year was based on corraboration, not unanimity across groups, such that a species was considered present if at least two groups noted its presence at a location. This allowed for the identification of both false positives and false negatives, both of which can penalize a group’s score.</w:t>
+      </w:r>
+    </w:p>
     <w:p>
       <w:pPr>
         <w:pStyle w:val="BodyText"/>
       </w:pPr>
       <w:r>
-        <w:t xml:space="preserve">note that we can’t run trend analyses on converted scores - these are always rescaled each year, since the primary goal is to serve as a motivating example each year. To assess trends, we really need to look at how avg raw differences have changed over time (see scratch.R).</w:t>
+        <w:t xml:space="preserve">All scores were first calculated at the smallest scale of species/metric/location, then scaled up to a metric/location score, then finally summed to a metric score. Three metric scores are assigned to each group for abundance, blade length, and density. The total score is a simple average of the metric scores. The entire process to score an individual group in a given year includes ten steps, as shown in</w:t>
+      </w:r>
+      <w:r>
+        <w:t xml:space="preserve"> </w:t>
+      </w:r>
+      <w:hyperlink w:anchor="fig-scoring_process">
+        <w:r>
+          <w:rPr>
+            <w:rStyle w:val="Hyperlink"/>
+          </w:rPr>
+          <w:t xml:space="preserve">Figure 1</w:t>
+        </w:r>
+      </w:hyperlink>
+      <w:r>
+        <w:t xml:space="preserve"> </w:t>
+      </w:r>
+      <w:r>
+        <w:t xml:space="preserve">and described in detail below.</w:t>
+      </w:r>
+    </w:p>
+    <w:bookmarkStart w:id="26" w:name="step-1-consensus-species-list"/>
+    <w:p>
+      <w:pPr>
+        <w:pStyle w:val="Heading4"/>
+      </w:pPr>
+      <w:r>
+        <w:t xml:space="preserve">2.1.1 Step 1: Consensus Species List</w:t>
+      </w:r>
+    </w:p>
+    <w:p>
+      <w:pPr>
+        <w:pStyle w:val="FirstParagraph"/>
+      </w:pPr>
+      <w:r>
+        <w:t xml:space="preserve">The first step requires identifying the consensus species that are present at each location. As noted above, a species was considered present at a location if identified by at least two groups. The species list could include both submerged aquatic vegetation (SAV or seagrass, typically</w:t>
+      </w:r>
+      <w:r>
+        <w:t xml:space="preserve"> </w:t>
+      </w:r>
+      <w:r>
+        <w:rPr>
+          <w:i/>
+          <w:iCs/>
+        </w:rPr>
+        <w:t xml:space="preserve">Halodule wrightii</w:t>
+      </w:r>
+      <w:r>
+        <w:t xml:space="preserve">,</w:t>
+      </w:r>
+      <w:r>
+        <w:t xml:space="preserve"> </w:t>
+      </w:r>
+      <w:r>
+        <w:rPr>
+          <w:i/>
+          <w:iCs/>
+        </w:rPr>
+        <w:t xml:space="preserve">Syringodium filiforme</w:t>
+      </w:r>
+      <w:r>
+        <w:t xml:space="preserve">, or</w:t>
+      </w:r>
+      <w:r>
+        <w:t xml:space="preserve"> </w:t>
+      </w:r>
+      <w:r>
+        <w:rPr>
+          <w:i/>
+          <w:iCs/>
+        </w:rPr>
+        <w:t xml:space="preserve">Thalassia testudinum</w:t>
+      </w:r>
+      <w:r>
+        <w:t xml:space="preserve">) or macroalgae (drift or attached, typically identified to species). By using corroboration as the basis for the species lists, species identified by only one group could be used to penalize a score as a false positive, whereas a species identified by at least two other groups but not another group also penalized the score as false negative.</w:t>
+      </w:r>
+    </w:p>
+    <w:bookmarkEnd w:id="26"/>
+    <w:bookmarkStart w:id="27" w:name="step-2-true-values"/>
+    <w:p>
+      <w:pPr>
+        <w:pStyle w:val="Heading4"/>
+      </w:pPr>
+      <w:r>
+        <w:t xml:space="preserve">2.1.2 Step 2: True Values</w:t>
+      </w:r>
+    </w:p>
+    <w:p>
+      <w:pPr>
+        <w:pStyle w:val="FirstParagraph"/>
+      </w:pPr>
+      <w:r>
+        <w:t xml:space="preserve">In this step, the</w:t>
+      </w:r>
+      <w:r>
+        <w:t xml:space="preserve"> </w:t>
+      </w:r>
+      <w:r>
+        <w:t xml:space="preserve">“true”</w:t>
+      </w:r>
+      <w:r>
+        <w:t xml:space="preserve"> </w:t>
+      </w:r>
+      <w:r>
+        <w:t xml:space="preserve">values are simply the cross-group means of the metrics for each species at each location. Although the averages are nominally true, they were not considered an absolute external ground truth since we acknowledge that no single group is perfect in their assessments. The true values are calculated only for the consensus species at each location. True values for abundance were estimated for all SAV and macroalgae species, whereas true values for blade length and short shoot density were calculated only for SAV. The abundance averages were based on the Braun-Blanquet values (0, 0.1, 0.5, 1, 2, 3, 4, or 5), which were snapped to the nearest value after averaging. Blade length and short shoot density were averaged in their native units (cm and shoots m</w:t>
+      </w:r>
+      <m:oMath>
+        <m:sSup>
+          <m:e>
+            <m:r>
+              <m:t>​</m:t>
+            </m:r>
+          </m:e>
+          <m:sup>
+            <m:r>
+              <m:rPr>
+                <m:sty m:val="p"/>
+              </m:rPr>
+              <m:t>−</m:t>
+            </m:r>
+            <m:r>
+              <m:t>2</m:t>
+            </m:r>
+          </m:sup>
+        </m:sSup>
+      </m:oMath>
+      <w:r>
+        <w:t xml:space="preserve">).</w:t>
+      </w:r>
+    </w:p>
+    <w:bookmarkEnd w:id="27"/>
+    <w:bookmarkStart w:id="28" w:name="Xe95b59c2e6333d2458f8932345195369f7baad0"/>
+    <w:p>
+      <w:pPr>
+        <w:pStyle w:val="Heading4"/>
+      </w:pPr>
+      <w:r>
+        <w:t xml:space="preserve">2.1.3 Step 3-6: Group Differences and Metric Scores</w:t>
+      </w:r>
+    </w:p>
+    <w:p>
+      <w:pPr>
+        <w:pStyle w:val="FirstParagraph"/>
+      </w:pPr>
+      <w:r>
+        <w:t xml:space="preserve">Steps 3-6 are repeated across species and metrics for a given group to combine results across each location. Specifically, results are first evaluated at each location to identify the species and metric differences from the true values, then the location values are combined using a weighted average to obtain species and metric scores. Weighting is used to discount or penalize scores based on variation in the true values. For example, scores are penalized for a group if all groups were more in agreement for a species and metric assessment, and vice versa. Similarly, false positives and missed species (false negatives) are also penalized in the abundance scores when combining scores across locations.</w:t>
+      </w:r>
+    </w:p>
+    <w:p>
+      <w:pPr>
+        <w:pStyle w:val="BodyText"/>
+      </w:pPr>
+      <w:r>
+        <w:t xml:space="preserve">In this</w:t>
       </w:r>
     </w:p>
     <w:p>
@@ -262,8 +431,28 @@
         <w:t xml:space="preserve">Sensitivity of the scoring method was evaluated two ways, the first assessing general sensitivity to the data used for the scoring and the second based on explicit decision for the year period used for defining the floor.</w:t>
       </w:r>
     </w:p>
-    <w:bookmarkEnd w:id="26"/>
-    <w:bookmarkStart w:id="27" w:name="results"/>
+    <w:bookmarkEnd w:id="28"/>
+    <w:bookmarkEnd w:id="29"/>
+    <w:bookmarkStart w:id="30" w:name="assessment-of-scores-over-time"/>
+    <w:p>
+      <w:pPr>
+        <w:pStyle w:val="Heading3"/>
+      </w:pPr>
+      <w:r>
+        <w:t xml:space="preserve">2.2 Assessment of scores over time</w:t>
+      </w:r>
+    </w:p>
+    <w:p>
+      <w:pPr>
+        <w:pStyle w:val="FirstParagraph"/>
+      </w:pPr>
+      <w:r>
+        <w:t xml:space="preserve">note that we can’t run trend analyses on converted scores - these are always rescaled each year, since the primary goal is to serve as a motivating example each year. To assess trends, we really need to look at how avg raw differences have changed over time (see scratch.R).</w:t>
+      </w:r>
+    </w:p>
+    <w:bookmarkEnd w:id="30"/>
+    <w:bookmarkEnd w:id="31"/>
+    <w:bookmarkStart w:id="32" w:name="results"/>
     <w:p>
       <w:pPr>
         <w:pStyle w:val="Heading2"/>
@@ -296,8 +485,8 @@
         <w:t xml:space="preserve">improving scores over time</w:t>
       </w:r>
     </w:p>
-    <w:bookmarkEnd w:id="27"/>
-    <w:bookmarkStart w:id="28" w:name="discussion"/>
+    <w:bookmarkEnd w:id="32"/>
+    <w:bookmarkStart w:id="33" w:name="discussion"/>
     <w:p>
       <w:pPr>
         <w:pStyle w:val="Heading2"/>
@@ -351,8 +540,8 @@
         <w:br w:type="page"/>
       </w:r>
     </w:p>
-    <w:bookmarkEnd w:id="28"/>
-    <w:bookmarkStart w:id="45" w:name="figures"/>
+    <w:bookmarkEnd w:id="33"/>
+    <w:bookmarkStart w:id="50" w:name="figures"/>
     <w:p>
       <w:pPr>
         <w:pStyle w:val="Heading2"/>
@@ -374,7 +563,7 @@
       <w:tr>
         <w:tc>
           <w:tcPr/>
-          <w:bookmarkStart w:id="32" w:name="fig-scoring_process"/>
+          <w:bookmarkStart w:id="37" w:name="fig-scoring_process"/>
           <w:p>
             <w:pPr>
               <w:pStyle w:val="Compact"/>
@@ -385,18 +574,18 @@
                 <wp:inline>
                   <wp:extent cx="5943600" cy="3962400"/>
                   <wp:effectExtent b="0" l="0" r="0" t="0"/>
-                  <wp:docPr descr="" title="" id="30" name="Picture"/>
+                  <wp:docPr descr="" title="" id="35" name="Picture"/>
                   <a:graphic>
                     <a:graphicData uri="http://schemas.openxmlformats.org/drawingml/2006/picture">
                       <pic:pic>
                         <pic:nvPicPr>
-                          <pic:cNvPr descr="figs/scoring_process.png" id="31" name="Picture"/>
+                          <pic:cNvPr descr="figs/scoring_process.png" id="36" name="Picture"/>
                           <pic:cNvPicPr>
                             <a:picLocks noChangeArrowheads="1" noChangeAspect="1"/>
                           </pic:cNvPicPr>
                         </pic:nvPicPr>
                         <pic:blipFill>
-                          <a:blip r:embed="rId29"/>
+                          <a:blip r:embed="rId34"/>
                           <a:stretch>
                             <a:fillRect/>
                           </a:stretch>
@@ -436,7 +625,7 @@
               <w:t xml:space="preserve">Fig. 1: Flowchart showing the scoring process from steps 1 to 10 for a single group in a given year. Step 3 involves all groups in the focal year and step 8 is a historical baseline from all groups for a set period of past trainings.</w:t>
             </w:r>
           </w:p>
-          <w:bookmarkEnd w:id="32"/>
+          <w:bookmarkEnd w:id="37"/>
         </w:tc>
       </w:tr>
     </w:tbl>
@@ -458,7 +647,7 @@
       <w:tr>
         <w:tc>
           <w:tcPr/>
-          <w:bookmarkStart w:id="36" w:name="fig-leaveoneout"/>
+          <w:bookmarkStart w:id="41" w:name="fig-leaveoneout"/>
           <w:p>
             <w:pPr>
               <w:pStyle w:val="Compact"/>
@@ -469,18 +658,18 @@
                 <wp:inline>
                   <wp:extent cx="5943600" cy="4457699"/>
                   <wp:effectExtent b="0" l="0" r="0" t="0"/>
-                  <wp:docPr descr="" title="" id="34" name="Picture"/>
+                  <wp:docPr descr="" title="" id="39" name="Picture"/>
                   <a:graphic>
                     <a:graphicData uri="http://schemas.openxmlformats.org/drawingml/2006/picture">
                       <pic:pic>
                         <pic:nvPicPr>
-                          <pic:cNvPr descr="figs/leaveoneout.png" id="35" name="Picture"/>
+                          <pic:cNvPr descr="figs/leaveoneout.png" id="40" name="Picture"/>
                           <pic:cNvPicPr>
                             <a:picLocks noChangeArrowheads="1" noChangeAspect="1"/>
                           </pic:cNvPicPr>
                         </pic:nvPicPr>
                         <pic:blipFill>
-                          <a:blip r:embed="rId33"/>
+                          <a:blip r:embed="rId38"/>
                           <a:stretch>
                             <a:fillRect/>
                           </a:stretch>
@@ -534,7 +723,7 @@
               <w:t xml:space="preserve">values represent the correlations between the recalculated values after removing one site and the full values with all sites. The dashed lines are 1:1 relationships.</w:t>
             </w:r>
           </w:p>
-          <w:bookmarkEnd w:id="36"/>
+          <w:bookmarkEnd w:id="41"/>
         </w:tc>
       </w:tr>
     </w:tbl>
@@ -556,7 +745,7 @@
       <w:tr>
         <w:tc>
           <w:tcPr/>
-          <w:bookmarkStart w:id="40" w:name="fig-calsens"/>
+          <w:bookmarkStart w:id="45" w:name="fig-calsens"/>
           <w:p>
             <w:pPr>
               <w:pStyle w:val="Compact"/>
@@ -567,18 +756,18 @@
                 <wp:inline>
                   <wp:extent cx="5504749" cy="5504749"/>
                   <wp:effectExtent b="0" l="0" r="0" t="0"/>
-                  <wp:docPr descr="" title="" id="38" name="Picture"/>
+                  <wp:docPr descr="" title="" id="43" name="Picture"/>
                   <a:graphic>
                     <a:graphicData uri="http://schemas.openxmlformats.org/drawingml/2006/picture">
                       <pic:pic>
                         <pic:nvPicPr>
-                          <pic:cNvPr descr="figs/calsens.png" id="39" name="Picture"/>
+                          <pic:cNvPr descr="figs/calsens.png" id="44" name="Picture"/>
                           <pic:cNvPicPr>
                             <a:picLocks noChangeArrowheads="1" noChangeAspect="1"/>
                           </pic:cNvPicPr>
                         </pic:nvPicPr>
                         <pic:blipFill>
-                          <a:blip r:embed="rId37"/>
+                          <a:blip r:embed="rId42"/>
                           <a:stretch>
                             <a:fillRect/>
                           </a:stretch>
@@ -618,7 +807,7 @@
               <w:t xml:space="preserve">Fig. 3: Sensitivity of the calculated floor for the metric scores based on length of the calibration period. Different calibration periods of two to six years from the beginning of the period of record were evaluated and are shown by point color. The black line is the mean floor across calibration periods for each year and metric. Points are jittered on the x-axis within each year.</w:t>
             </w:r>
           </w:p>
-          <w:bookmarkEnd w:id="40"/>
+          <w:bookmarkEnd w:id="45"/>
         </w:tc>
       </w:tr>
     </w:tbl>
@@ -640,7 +829,7 @@
       <w:tr>
         <w:tc>
           <w:tcPr/>
-          <w:bookmarkStart w:id="44" w:name="fig-scrdevmods"/>
+          <w:bookmarkStart w:id="49" w:name="fig-scrdevmods"/>
           <w:p>
             <w:pPr>
               <w:pStyle w:val="Compact"/>
@@ -651,18 +840,18 @@
                 <wp:inline>
                   <wp:extent cx="5943600" cy="3512127"/>
                   <wp:effectExtent b="0" l="0" r="0" t="0"/>
-                  <wp:docPr descr="" title="" id="42" name="Picture"/>
+                  <wp:docPr descr="" title="" id="47" name="Picture"/>
                   <a:graphic>
                     <a:graphicData uri="http://schemas.openxmlformats.org/drawingml/2006/picture">
                       <pic:pic>
                         <pic:nvPicPr>
-                          <pic:cNvPr descr="figs/scrdevmods.png" id="43" name="Picture"/>
+                          <pic:cNvPr descr="figs/scrdevmods.png" id="48" name="Picture"/>
                           <pic:cNvPicPr>
                             <a:picLocks noChangeArrowheads="1" noChangeAspect="1"/>
                           </pic:cNvPicPr>
                         </pic:nvPicPr>
                         <pic:blipFill>
-                          <a:blip r:embed="rId41"/>
+                          <a:blip r:embed="rId46"/>
                           <a:stretch>
                             <a:fillRect/>
                           </a:stretch>
@@ -702,7 +891,7 @@
               <w:t xml:space="preserve">Fig. 4: Results of mixed-effects models comparing group scores (top row) and absolute deviations (bottom row) over time. The models in the top row evaluate scores as a function of time with a random group effect, whereas the models in the bottom row evaluate the absolute deviation of each group’s reported value from the cross-group consensus (true) value, with random effects for species and group. Solid lines show the overall group or group/species means and the dashed lines show individual effects for group or group by species combinations. The bottom right plot (Short Shoot Density) is a singular fit with both species and group random-intercept variances estimated as zero, so only the fixed-effect trend is shown. None of the relationships are significant (ns: not significant).</w:t>
             </w:r>
           </w:p>
-          <w:bookmarkEnd w:id="44"/>
+          <w:bookmarkEnd w:id="49"/>
         </w:tc>
       </w:tr>
     </w:tbl>
@@ -711,8 +900,8 @@
         <w:br w:type="page"/>
       </w:r>
     </w:p>
-    <w:bookmarkEnd w:id="45"/>
-    <w:bookmarkStart w:id="49" w:name="tables"/>
+    <w:bookmarkEnd w:id="50"/>
+    <w:bookmarkStart w:id="54" w:name="tables"/>
     <w:p>
       <w:pPr>
         <w:pStyle w:val="Heading2"/>
@@ -734,7 +923,7 @@
       <w:tr>
         <w:tc>
           <w:tcPr/>
-          <w:bookmarkStart w:id="46" w:name="tbl-scrmodstab"/>
+          <w:bookmarkStart w:id="51" w:name="tbl-scrmodstab"/>
           <w:p>
             <w:pPr>
               <w:jc w:val="center"/>
@@ -1923,7 +2112,7 @@
               </w:tc>
             </w:tr>
           </w:tbl>
-          <w:bookmarkEnd w:id="46"/>
+          <w:bookmarkEnd w:id="51"/>
         </w:tc>
       </w:tr>
     </w:tbl>
@@ -1945,7 +2134,7 @@
       <w:tr>
         <w:tc>
           <w:tcPr/>
-          <w:bookmarkStart w:id="47" w:name="tbl-spmodstab"/>
+          <w:bookmarkStart w:id="52" w:name="tbl-spmodstab"/>
           <w:p>
             <w:pPr>
               <w:jc w:val="center"/>
@@ -3568,7 +3757,7 @@
               </w:tc>
             </w:tr>
           </w:tbl>
-          <w:bookmarkEnd w:id="47"/>
+          <w:bookmarkEnd w:id="52"/>
         </w:tc>
       </w:tr>
     </w:tbl>
@@ -3590,7 +3779,7 @@
       <w:tr>
         <w:tc>
           <w:tcPr/>
-          <w:bookmarkStart w:id="48" w:name="tbl-slopetab"/>
+          <w:bookmarkStart w:id="53" w:name="tbl-slopetab"/>
           <w:p>
             <w:pPr>
               <w:jc w:val="center"/>
@@ -8039,7 +8228,7 @@
               </w:tc>
             </w:tr>
           </w:tbl>
-          <w:bookmarkEnd w:id="48"/>
+          <w:bookmarkEnd w:id="53"/>
         </w:tc>
       </w:tr>
     </w:tbl>
@@ -8048,8 +8237,8 @@
         <w:br w:type="page"/>
       </w:r>
     </w:p>
-    <w:bookmarkEnd w:id="49"/>
-    <w:bookmarkStart w:id="51" w:name="data-availability"/>
+    <w:bookmarkEnd w:id="54"/>
+    <w:bookmarkStart w:id="56" w:name="data-availability"/>
     <w:p>
       <w:pPr>
         <w:pStyle w:val="Heading2"/>
@@ -8068,7 +8257,7 @@
       <w:r>
         <w:t xml:space="preserve"> </w:t>
       </w:r>
-      <w:hyperlink r:id="rId50">
+      <w:hyperlink r:id="rId55">
         <w:r>
           <w:rPr>
             <w:rStyle w:val="Hyperlink"/>
@@ -8080,8 +8269,8 @@
         <w:t xml:space="preserve">.</w:t>
       </w:r>
     </w:p>
-    <w:bookmarkEnd w:id="51"/>
-    <w:bookmarkStart w:id="52" w:name="acknowledgments"/>
+    <w:bookmarkEnd w:id="56"/>
+    <w:bookmarkStart w:id="57" w:name="acknowledgments"/>
     <w:p>
       <w:pPr>
         <w:pStyle w:val="Heading2"/>
@@ -8090,8 +8279,8 @@
         <w:t xml:space="preserve">Acknowledgments</w:t>
       </w:r>
     </w:p>
-    <w:bookmarkEnd w:id="52"/>
-    <w:bookmarkStart w:id="53" w:name="references"/>
+    <w:bookmarkEnd w:id="57"/>
+    <w:bookmarkStart w:id="58" w:name="references"/>
     <w:p>
       <w:pPr>
         <w:pStyle w:val="Heading2"/>
@@ -8100,7 +8289,7 @@
         <w:t xml:space="preserve">References</w:t>
       </w:r>
     </w:p>
-    <w:bookmarkEnd w:id="53"/>
+    <w:bookmarkEnd w:id="58"/>
     <w:sectPr>
       <w:footerReference r:id="rId9" w:type="default"/>
       <w:pgSz w:h="15840" w:w="12240"/>

</xml_diff>

<commit_message>
a bit to methods
</commit_message>
<xml_diff>
--- a/manu-draft.docx
+++ b/manu-draft.docx
@@ -260,7 +260,7 @@
         <w:pStyle w:val="FirstParagraph"/>
       </w:pPr>
       <w:r>
-        <w:t xml:space="preserve">The scoring method was developed to compare consistency among groups that participated in the training each year, i.e., how closely a group’s results compared to the overall group mean in a given year. No single external ground truth exists, so precision was used as the basis of scoring. Additionally, the species list for a given year was based on corraboration, not unanimity across groups, such that a species was considered present if at least two groups noted its presence at a location. This allowed for the identification of both false positives and false negatives, both of which can penalize a group’s score.</w:t>
+        <w:t xml:space="preserve">The scoring method was developed to compare consistency among groups that participated in the training each year, i.e., how closely a group’s results compared to the overall group mean in a given year. No single external ground truth exists, so precision was used as the basis of scoring. Additionally, the species list for a given year was based on corraboration, not unanimity across groups, such that a species was considered present if at least two groups found it at a location. This allowed for the identification of both false positives and false negatives, both of which can penalize a group’s score as described below.</w:t>
       </w:r>
     </w:p>
     <w:p>
@@ -268,7 +268,7 @@
         <w:pStyle w:val="BodyText"/>
       </w:pPr>
       <w:r>
-        <w:t xml:space="preserve">All scores were first calculated at the smallest scale of species/metric/location, then scaled up to a metric/location score, then finally summed to a metric score. Three metric scores are assigned to each group for abundance, blade length, and density. The total score is a simple average of the metric scores. The entire process to score an individual group in a given year includes ten steps, as shown in</w:t>
+        <w:t xml:space="preserve">All scores were first calculated at the smallest scale of species/metric/location, then scaled up to a metric/location score, then finally summed to a metric score. Three scores are assigned to each group for the abundance, blade length, and short shoot density metrics. The total score is a simple average of the metric scores. The entire process to score an individual group in a given year includes ten steps, as shown in</w:t>
       </w:r>
       <w:r>
         <w:t xml:space="preserve"> </w:t>
@@ -359,7 +359,7 @@
         <w:pStyle w:val="FirstParagraph"/>
       </w:pPr>
       <w:r>
-        <w:t xml:space="preserve">In this step, the</w:t>
+        <w:t xml:space="preserve">The true values for the species metrics at each transect are then identified as the basis of comparison for each group in a given training year. In this step, the</w:t>
       </w:r>
       <w:r>
         <w:t xml:space="preserve"> </w:t>
@@ -371,7 +371,7 @@
         <w:t xml:space="preserve"> </w:t>
       </w:r>
       <w:r>
-        <w:t xml:space="preserve">values are simply the cross-group means of the metrics for each species at each location. Although the averages are nominally true, they were not considered an absolute external ground truth since we acknowledge that no single group is perfect in their assessments. The true values are calculated only for the consensus species at each location. True values for abundance were estimated for all SAV and macroalgae species, whereas true values for blade length and short shoot density were calculated only for SAV. The abundance averages were based on the Braun-Blanquet values (0, 0.1, 0.5, 1, 2, 3, 4, or 5), which were snapped to the nearest value after averaging. Blade length and short shoot density were averaged in their native units (cm and shoots m</w:t>
+        <w:t xml:space="preserve">values are simply the cross-group means of the metrics for each species at each location. Although the averages are nominally true, they were not considered an absolute external ground truth since we acknowledge that no single group is perfect in their assessments. The true values are calculated only for the consensus species at each location. True values for abundance were estimated for all SAV and macroalgae species, whereas true values for blade length and short shoot density were calculated only for SAV since these values are not recorded for macroalgae. The abundance averages were based on the Braun-Blanquet values (0, 0.1, 0.5, 1, 2, 3, 4, or 5), which were snapped to the nearest value after averaging. Blade length and short shoot density were averaged in their native units (cm and shoots m</w:t>
       </w:r>
       <m:oMath>
         <m:sSup>
@@ -412,7 +412,7 @@
         <w:pStyle w:val="FirstParagraph"/>
       </w:pPr>
       <w:r>
-        <w:t xml:space="preserve">Steps 3-6 are repeated across species and metrics for a given group to combine results across each location. Specifically, results are first evaluated at each location to identify the species and metric differences from the true values, then the location values are combined using a weighted average to obtain species and metric scores. Weighting is used to discount or penalize scores based on variation in the true values. For example, scores are penalized for a group if all groups were more in agreement for a species and metric assessment, and vice versa. Similarly, false positives and missed species (false negatives) are also penalized in the abundance scores when combining scores across locations.</w:t>
+        <w:t xml:space="preserve">Steps 3-6 are repeated across species and metrics for a given group to combine results across each location. Specifically, results are first evaluated at each location to identify the species and metric differences from the true values, then the location values are combined using a weighted average to obtain species and metric scores. Weighting is used to discount or penalize scores based on variation in the true values. For example, differences from the true values are penalized more heavily for a group if all groups were more in agreement for a species and metric assessment, and vice versa. Similarly, false positives and missed species (false negatives) are also penalized in the abundance scores when combining scores across locations. The mechanics of these differences, their penalties, and species weighting is described in detail below.</w:t>
       </w:r>
     </w:p>
     <w:p>
@@ -420,7 +420,300 @@
         <w:pStyle w:val="BodyText"/>
       </w:pPr>
       <w:r>
-        <w:t xml:space="preserve">In this</w:t>
+        <w:t xml:space="preserve">For these steps, differences in a group’s reported values from the true values are calculated two ways. For abundance and blade length, the difference</w:t>
+      </w:r>
+      <w:r>
+        <w:t xml:space="preserve"> </w:t>
+      </w:r>
+      <m:oMath>
+        <m:r>
+          <m:t>d</m:t>
+        </m:r>
+      </m:oMath>
+      <w:r>
+        <w:t xml:space="preserve"> </w:t>
+      </w:r>
+      <w:r>
+        <w:t xml:space="preserve">for species</w:t>
+      </w:r>
+      <w:r>
+        <w:t xml:space="preserve"> </w:t>
+      </w:r>
+      <m:oMath>
+        <m:r>
+          <m:t>s</m:t>
+        </m:r>
+      </m:oMath>
+      <w:r>
+        <w:t xml:space="preserve"> </w:t>
+      </w:r>
+      <w:r>
+        <w:t xml:space="preserve">at transect</w:t>
+      </w:r>
+      <w:r>
+        <w:t xml:space="preserve"> </w:t>
+      </w:r>
+      <m:oMath>
+        <m:r>
+          <m:t>t</m:t>
+        </m:r>
+      </m:oMath>
+      <w:r>
+        <w:t xml:space="preserve"> </w:t>
+      </w:r>
+      <w:r>
+        <w:t xml:space="preserve">is a simple subtraction:</w:t>
+      </w:r>
+    </w:p>
+    <w:p>
+      <w:pPr>
+        <w:pStyle w:val="BodyText"/>
+      </w:pPr>
+      <m:oMathPara>
+        <m:oMathParaPr>
+          <m:jc m:val="center"/>
+        </m:oMathParaPr>
+        <m:oMath>
+          <m:sSub>
+            <m:e>
+              <m:r>
+                <m:t>d</m:t>
+              </m:r>
+            </m:e>
+            <m:sub>
+              <m:r>
+                <m:t>s</m:t>
+              </m:r>
+              <m:r>
+                <m:rPr>
+                  <m:sty m:val="p"/>
+                </m:rPr>
+                <m:t>,</m:t>
+              </m:r>
+              <m:r>
+                <m:t>t</m:t>
+              </m:r>
+            </m:sub>
+          </m:sSub>
+          <m:r>
+            <m:rPr>
+              <m:sty m:val="p"/>
+            </m:rPr>
+            <m:t>=</m:t>
+          </m:r>
+          <m:r>
+            <m:rPr>
+              <m:nor/>
+              <m:sty m:val="p"/>
+            </m:rPr>
+            <m:t>reported</m:t>
+          </m:r>
+          <m:r>
+            <m:rPr>
+              <m:sty m:val="p"/>
+            </m:rPr>
+            <m:t>−</m:t>
+          </m:r>
+          <m:r>
+            <m:rPr>
+              <m:nor/>
+              <m:sty m:val="p"/>
+            </m:rPr>
+            <m:t>true</m:t>
+          </m:r>
+        </m:oMath>
+      </m:oMathPara>
+    </w:p>
+    <w:p>
+      <w:pPr>
+        <w:pStyle w:val="FirstParagraph"/>
+      </w:pPr>
+      <w:r>
+        <w:t xml:space="preserve">For short shoot density, the difference is a symmetric percent difference:</w:t>
+      </w:r>
+    </w:p>
+    <w:p>
+      <w:pPr>
+        <w:pStyle w:val="BodyText"/>
+      </w:pPr>
+      <m:oMathPara>
+        <m:oMathParaPr>
+          <m:jc m:val="center"/>
+        </m:oMathParaPr>
+        <m:oMath>
+          <m:sSub>
+            <m:e>
+              <m:r>
+                <m:t>d</m:t>
+              </m:r>
+            </m:e>
+            <m:sub>
+              <m:r>
+                <m:t>s</m:t>
+              </m:r>
+              <m:r>
+                <m:rPr>
+                  <m:sty m:val="p"/>
+                </m:rPr>
+                <m:t>,</m:t>
+              </m:r>
+              <m:r>
+                <m:t>t</m:t>
+              </m:r>
+            </m:sub>
+          </m:sSub>
+          <m:r>
+            <m:rPr>
+              <m:sty m:val="p"/>
+            </m:rPr>
+            <m:t>=</m:t>
+          </m:r>
+          <m:f>
+            <m:fPr>
+              <m:type m:val="bar"/>
+            </m:fPr>
+            <m:num>
+              <m:r>
+                <m:rPr>
+                  <m:nor/>
+                  <m:sty m:val="p"/>
+                </m:rPr>
+                <m:t>reported</m:t>
+              </m:r>
+              <m:r>
+                <m:rPr>
+                  <m:sty m:val="p"/>
+                </m:rPr>
+                <m:t>−</m:t>
+              </m:r>
+              <m:r>
+                <m:rPr>
+                  <m:nor/>
+                  <m:sty m:val="p"/>
+                </m:rPr>
+                <m:t>true</m:t>
+              </m:r>
+            </m:num>
+            <m:den>
+              <m:d>
+                <m:dPr>
+                  <m:begChr m:val="("/>
+                  <m:sepChr m:val=""/>
+                  <m:endChr m:val=")"/>
+                  <m:grow/>
+                </m:dPr>
+                <m:e>
+                  <m:r>
+                    <m:rPr>
+                      <m:nor/>
+                      <m:sty m:val="p"/>
+                    </m:rPr>
+                    <m:t>reported</m:t>
+                  </m:r>
+                  <m:r>
+                    <m:rPr>
+                      <m:sty m:val="p"/>
+                    </m:rPr>
+                    <m:t>+</m:t>
+                  </m:r>
+                  <m:r>
+                    <m:rPr>
+                      <m:nor/>
+                      <m:sty m:val="p"/>
+                    </m:rPr>
+                    <m:t>true</m:t>
+                  </m:r>
+                </m:e>
+              </m:d>
+              <m:r>
+                <m:rPr>
+                  <m:sty m:val="p"/>
+                </m:rPr>
+                <m:t>/</m:t>
+              </m:r>
+              <m:r>
+                <m:t>2</m:t>
+              </m:r>
+            </m:den>
+          </m:f>
+        </m:oMath>
+      </m:oMathPara>
+    </w:p>
+    <w:p>
+      <w:pPr>
+        <w:pStyle w:val="FirstParagraph"/>
+      </w:pPr>
+      <w:r>
+        <w:t xml:space="preserve">The symmetric percent difference was used for short shoot density because the magnitude of the difference varies with the magnitude of the raw measurements, which also varies by species (e.g.,</w:t>
+      </w:r>
+      <w:r>
+        <w:t xml:space="preserve"> </w:t>
+      </w:r>
+      <w:r>
+        <w:rPr>
+          <w:i/>
+          <w:iCs/>
+        </w:rPr>
+        <w:t xml:space="preserve">Halodule</w:t>
+      </w:r>
+      <w:r>
+        <w:t xml:space="preserve"> </w:t>
+      </w:r>
+      <w:r>
+        <w:t xml:space="preserve">short shoot density is typically higher than</w:t>
+      </w:r>
+      <w:r>
+        <w:t xml:space="preserve"> </w:t>
+      </w:r>
+      <w:r>
+        <w:rPr>
+          <w:i/>
+          <w:iCs/>
+        </w:rPr>
+        <w:t xml:space="preserve">Thalassia</w:t>
+      </w:r>
+      <w:r>
+        <w:t xml:space="preserve">). The symmetric percent difference removes this correlation by providing a common scale for assessing the differences.</w:t>
+      </w:r>
+    </w:p>
+    <w:p>
+      <w:pPr>
+        <w:pStyle w:val="BodyText"/>
+      </w:pPr>
+      <w:r>
+        <w:t xml:space="preserve">For abundance, the differences are in ordinal category positions for the Braun-Blanquet estimates (e.g., integer values from zero to eight for the values 0, 0.1, 0.5, 1, 2, 3, 4, and 5). Using the ordinal category positions for the differences simply considers rank value differences since the actual abundance values differ between the categories, i.e., it was not desired to have different scales of comparison for low or high abundance estimates. For a given group, the</w:t>
+      </w:r>
+      <w:r>
+        <w:t xml:space="preserve"> </w:t>
+      </w:r>
+      <m:oMath>
+        <m:sSub>
+          <m:e>
+            <m:r>
+              <m:t>d</m:t>
+            </m:r>
+          </m:e>
+          <m:sub>
+            <m:r>
+              <m:t>s</m:t>
+            </m:r>
+            <m:r>
+              <m:rPr>
+                <m:sty m:val="p"/>
+              </m:rPr>
+              <m:t>,</m:t>
+            </m:r>
+            <m:r>
+              <m:t>t</m:t>
+            </m:r>
+          </m:sub>
+        </m:sSub>
+      </m:oMath>
+      <w:r>
+        <w:t xml:space="preserve"> </w:t>
+      </w:r>
+      <w:r>
+        <w:t xml:space="preserve">values for abundance are esimates for each species and transect using the consensus species list at that location. If a group missed a species, it is assigned a zero, where as a false positive is given a value of 1 since</w:t>
       </w:r>
     </w:p>
     <w:p>

</xml_diff>

<commit_message>
add report card screenshot
</commit_message>
<xml_diff>
--- a/manu-draft.docx
+++ b/manu-draft.docx
@@ -1972,7 +1972,21 @@
         <w:pStyle w:val="BodyText"/>
       </w:pPr>
       <w:r>
-        <w:t xml:space="preserve">Each group that participated in an annual training received an online report card to both motivate and provide additional resources if improvements were warranted. These reports were parameterized as a Quarto dashboard that used a single template applied to each group and year. The first tab of the report showed the group’s scores for a year for each of the three metrics, the raw differences for the species used in each metric, the overall score, and a table showing individual transect outcomes relative to the group means. The second tab provided additional resources to consult if a group was deficient in any given area (i.e., species identification, large deviation for any of the metrics). Any letter grades less than A- for the scores or any false positives or missed species prompted a conditional display of resources, otherwise, a satisfactory note was provided. The resources included online documentation and video training resources curated by the TBEP.</w:t>
+        <w:t xml:space="preserve">Each group that participated in an annual training received an online report card to both motivate and provide additional resources if improvements were warranted</w:t>
+      </w:r>
+      <w:r>
+        <w:t xml:space="preserve"> </w:t>
+      </w:r>
+      <w:hyperlink w:anchor="fig-reportcard">
+        <w:r>
+          <w:rPr>
+            <w:rStyle w:val="Hyperlink"/>
+          </w:rPr>
+          <w:t xml:space="preserve">Figure 2</w:t>
+        </w:r>
+      </w:hyperlink>
+      <w:r>
+        <w:t xml:space="preserve">. These reports were parameterized as a Quarto dashboard that used a single template applied to each group and year. The first tab of the report showed the group’s scores for a year for each of the three metrics, the raw differences for the species used in each metric, the overall score, and a table showing individual transect outcomes relative to the group means. The second tab provided additional resources to consult if a group was deficient in any given area (i.e., species identification, large deviation for any of the metrics). Any letter grades less than A- for the scores or any false positives or missed species prompted a conditional display of resources, otherwise, a satisfactory note was provided. The resources included online documentation and video training resources curated by the TBEP.</w:t>
       </w:r>
     </w:p>
     <w:bookmarkEnd w:id="37"/>
@@ -2202,7 +2216,7 @@
       </w:r>
     </w:p>
     <w:bookmarkEnd w:id="43"/>
-    <w:bookmarkStart w:id="60" w:name="figures"/>
+    <w:bookmarkStart w:id="64" w:name="figures"/>
     <w:p>
       <w:pPr>
         <w:pStyle w:val="Heading2"/>
@@ -2308,7 +2322,91 @@
       <w:tr>
         <w:tc>
           <w:tcPr/>
-          <w:bookmarkStart w:id="51" w:name="fig-leaveoneout"/>
+          <w:bookmarkStart w:id="51" w:name="fig-reportcard"/>
+          <w:p>
+            <w:pPr>
+              <w:pStyle w:val="Compact"/>
+              <w:jc w:val="center"/>
+            </w:pPr>
+            <w:r>
+              <w:drawing>
+                <wp:inline>
+                  <wp:extent cx="5943600" cy="3776360"/>
+                  <wp:effectExtent b="0" l="0" r="0" t="0"/>
+                  <wp:docPr descr="" title="" id="49" name="Picture"/>
+                  <a:graphic>
+                    <a:graphicData uri="http://schemas.openxmlformats.org/drawingml/2006/picture">
+                      <pic:pic>
+                        <pic:nvPicPr>
+                          <pic:cNvPr descr="figs/reportcard.png" id="50" name="Picture"/>
+                          <pic:cNvPicPr>
+                            <a:picLocks noChangeArrowheads="1" noChangeAspect="1"/>
+                          </pic:cNvPicPr>
+                        </pic:nvPicPr>
+                        <pic:blipFill>
+                          <a:blip r:embed="rId48"/>
+                          <a:stretch>
+                            <a:fillRect/>
+                          </a:stretch>
+                        </pic:blipFill>
+                        <pic:spPr bwMode="auto">
+                          <a:xfrm>
+                            <a:off x="0" y="0"/>
+                            <a:ext cx="5943600" cy="3776360"/>
+                          </a:xfrm>
+                          <a:prstGeom prst="rect">
+                            <a:avLst/>
+                          </a:prstGeom>
+                          <a:noFill/>
+                          <a:ln w="9525">
+                            <a:noFill/>
+                            <a:headEnd/>
+                            <a:tailEnd/>
+                          </a:ln>
+                        </pic:spPr>
+                      </pic:pic>
+                    </a:graphicData>
+                  </a:graphic>
+                </wp:inline>
+              </w:drawing>
+            </w:r>
+          </w:p>
+          <w:p>
+            <w:pPr>
+              <w:jc w:val="center"/>
+            </w:pPr>
+            <w:pPr>
+              <w:jc w:val="left"/>
+              <w:spacing w:before="200"/>
+              <w:pStyle w:val="ImageCaption"/>
+            </w:pPr>
+            <w:r>
+              <w:t xml:space="preserve">Fig. 2: Landing page for a group’s annual report card showing the overall score (top left), metric scores (bottom row), and barplots of deviations for each species used to calculate the metric scores. Also available is a summary of results for each species at each transect and an additional tab with resources on how to improve the scores.</w:t>
+            </w:r>
+          </w:p>
+          <w:bookmarkEnd w:id="51"/>
+        </w:tc>
+      </w:tr>
+    </w:tbl>
+    <w:p>
+      <w:r>
+        <w:br w:type="page"/>
+      </w:r>
+    </w:p>
+    <w:tbl>
+      <w:tblPr>
+        <w:tblStyle w:val="Table"/>
+        <w:tblW w:type="pct" w:w="5000"/>
+        <w:tblLayout w:type="fixed"/>
+        <w:tblLook w:firstRow="0" w:lastRow="0" w:firstColumn="0" w:lastColumn="0" w:noHBand="0" w:noVBand="0" w:val="0000"/>
+      </w:tblPr>
+      <w:tblGrid>
+        <w:gridCol w:w="7920"/>
+      </w:tblGrid>
+      <w:tr>
+        <w:tc>
+          <w:tcPr/>
+          <w:bookmarkStart w:id="55" w:name="fig-leaveoneout"/>
           <w:p>
             <w:pPr>
               <w:pStyle w:val="Compact"/>
@@ -2319,18 +2417,18 @@
                 <wp:inline>
                   <wp:extent cx="5943600" cy="4457699"/>
                   <wp:effectExtent b="0" l="0" r="0" t="0"/>
-                  <wp:docPr descr="" title="" id="49" name="Picture"/>
+                  <wp:docPr descr="" title="" id="53" name="Picture"/>
                   <a:graphic>
                     <a:graphicData uri="http://schemas.openxmlformats.org/drawingml/2006/picture">
                       <pic:pic>
                         <pic:nvPicPr>
-                          <pic:cNvPr descr="figs/leaveoneout.png" id="50" name="Picture"/>
+                          <pic:cNvPr descr="figs/leaveoneout.png" id="54" name="Picture"/>
                           <pic:cNvPicPr>
                             <a:picLocks noChangeArrowheads="1" noChangeAspect="1"/>
                           </pic:cNvPicPr>
                         </pic:nvPicPr>
                         <pic:blipFill>
-                          <a:blip r:embed="rId48"/>
+                          <a:blip r:embed="rId52"/>
                           <a:stretch>
                             <a:fillRect/>
                           </a:stretch>
@@ -2367,7 +2465,7 @@
               <w:pStyle w:val="ImageCaption"/>
             </w:pPr>
             <w:r>
-              <w:t xml:space="preserve">Fig. 2: Comparison of raw deviations (top row) and scores (bottom row) for each of three metrics following a leave-one-site-out analysis across all years. The values on the y-axis represent the newly calculated raw deviations or scores after removing one site for each of all sampling years, repeated until each site was removed once. The x-axis shows the original full-sample value for comparison. Points are colored by year. The</w:t>
+              <w:t xml:space="preserve">Fig. 3: Comparison of raw deviations (top row) and scores (bottom row) for each of three metrics following a leave-one-site-out analysis across all years. The values on the y-axis represent the newly calculated raw deviations or scores after removing one site for each of all sampling years, repeated until each site was removed once. The x-axis shows the original full-sample value for comparison. Points are colored by year. The</w:t>
             </w:r>
             <w:r>
               <w:t xml:space="preserve"> </w:t>
@@ -2384,7 +2482,7 @@
               <w:t xml:space="preserve">values represent the correlations between the recalculated values after removing one site and the full values with all sites. The dashed lines are 1:1 relationships.</w:t>
             </w:r>
           </w:p>
-          <w:bookmarkEnd w:id="51"/>
+          <w:bookmarkEnd w:id="55"/>
         </w:tc>
       </w:tr>
     </w:tbl>
@@ -2406,7 +2504,7 @@
       <w:tr>
         <w:tc>
           <w:tcPr/>
-          <w:bookmarkStart w:id="55" w:name="fig-calsens"/>
+          <w:bookmarkStart w:id="59" w:name="fig-calsens"/>
           <w:p>
             <w:pPr>
               <w:pStyle w:val="Compact"/>
@@ -2417,18 +2515,18 @@
                 <wp:inline>
                   <wp:extent cx="5504749" cy="5504749"/>
                   <wp:effectExtent b="0" l="0" r="0" t="0"/>
-                  <wp:docPr descr="" title="" id="53" name="Picture"/>
+                  <wp:docPr descr="" title="" id="57" name="Picture"/>
                   <a:graphic>
                     <a:graphicData uri="http://schemas.openxmlformats.org/drawingml/2006/picture">
                       <pic:pic>
                         <pic:nvPicPr>
-                          <pic:cNvPr descr="figs/calsens.png" id="54" name="Picture"/>
+                          <pic:cNvPr descr="figs/calsens.png" id="58" name="Picture"/>
                           <pic:cNvPicPr>
                             <a:picLocks noChangeArrowheads="1" noChangeAspect="1"/>
                           </pic:cNvPicPr>
                         </pic:nvPicPr>
                         <pic:blipFill>
-                          <a:blip r:embed="rId52"/>
+                          <a:blip r:embed="rId56"/>
                           <a:stretch>
                             <a:fillRect/>
                           </a:stretch>
@@ -2465,10 +2563,10 @@
               <w:pStyle w:val="ImageCaption"/>
             </w:pPr>
             <w:r>
-              <w:t xml:space="preserve">Fig. 3: Sensitivity of the calculated floor for the metric scores based on length of the calibration period. Different calibration periods of two to six years from the beginning of the period of record were evaluated and are shown by point color. The black line is the mean floor across calibration periods for each year and metric. Points are jittered on the x-axis within each year.</w:t>
+              <w:t xml:space="preserve">Fig. 4: Sensitivity of the calculated floor for the metric scores based on length of the calibration period. Different calibration periods of two to six years from the beginning of the period of record were evaluated and are shown by point color. The black line is the mean floor across calibration periods for each year and metric. Points are jittered on the x-axis within each year.</w:t>
             </w:r>
           </w:p>
-          <w:bookmarkEnd w:id="55"/>
+          <w:bookmarkEnd w:id="59"/>
         </w:tc>
       </w:tr>
     </w:tbl>
@@ -2490,7 +2588,7 @@
       <w:tr>
         <w:tc>
           <w:tcPr/>
-          <w:bookmarkStart w:id="59" w:name="fig-scrdevmods"/>
+          <w:bookmarkStart w:id="63" w:name="fig-scrdevmods"/>
           <w:p>
             <w:pPr>
               <w:pStyle w:val="Compact"/>
@@ -2501,18 +2599,18 @@
                 <wp:inline>
                   <wp:extent cx="5943600" cy="3512127"/>
                   <wp:effectExtent b="0" l="0" r="0" t="0"/>
-                  <wp:docPr descr="" title="" id="57" name="Picture"/>
+                  <wp:docPr descr="" title="" id="61" name="Picture"/>
                   <a:graphic>
                     <a:graphicData uri="http://schemas.openxmlformats.org/drawingml/2006/picture">
                       <pic:pic>
                         <pic:nvPicPr>
-                          <pic:cNvPr descr="figs/scrdevmods.png" id="58" name="Picture"/>
+                          <pic:cNvPr descr="figs/scrdevmods.png" id="62" name="Picture"/>
                           <pic:cNvPicPr>
                             <a:picLocks noChangeArrowheads="1" noChangeAspect="1"/>
                           </pic:cNvPicPr>
                         </pic:nvPicPr>
                         <pic:blipFill>
-                          <a:blip r:embed="rId56"/>
+                          <a:blip r:embed="rId60"/>
                           <a:stretch>
                             <a:fillRect/>
                           </a:stretch>
@@ -2549,10 +2647,10 @@
               <w:pStyle w:val="ImageCaption"/>
             </w:pPr>
             <w:r>
-              <w:t xml:space="preserve">Fig. 4: Results of mixed-effects models comparing group scores (top row) and absolute deviations (bottom row) over time. The models in the top row evaluate scores as a function of time with a random group effect, whereas the models in the bottom row evaluate the absolute deviation of each group’s reported value from the cross-group consensus (true) value, with random effects for species and group. Solid lines show the overall group or group/species means and the dashed lines show individual effects for group or group by species combinations. The bottom right plot (Short Shoot Density) is a singular fit with both species and group random-intercept variances estimated as zero, so only the fixed-effect trend is shown. None of the relationships are significant (ns: not significant).</w:t>
+              <w:t xml:space="preserve">Fig. 5: Results of mixed-effects models comparing group scores (top row) and absolute deviations (bottom row) over time. The models in the top row evaluate scores as a function of time with a random group effect, whereas the models in the bottom row evaluate the absolute deviation of each group’s reported value from the cross-group consensus (true) value, with random effects for species and group. Solid lines show the overall group or group/species means and the dashed lines show individual effects for group or group by species combinations. The bottom right plot (Short Shoot Density) is a singular fit with both species and group random-intercept variances estimated as zero, so only the fixed-effect trend is shown. None of the relationships are significant (ns: not significant).</w:t>
             </w:r>
           </w:p>
-          <w:bookmarkEnd w:id="59"/>
+          <w:bookmarkEnd w:id="63"/>
         </w:tc>
       </w:tr>
     </w:tbl>
@@ -2561,8 +2659,8 @@
         <w:br w:type="page"/>
       </w:r>
     </w:p>
-    <w:bookmarkEnd w:id="60"/>
-    <w:bookmarkStart w:id="64" w:name="tables"/>
+    <w:bookmarkEnd w:id="64"/>
+    <w:bookmarkStart w:id="68" w:name="tables"/>
     <w:p>
       <w:pPr>
         <w:pStyle w:val="Heading2"/>
@@ -2584,7 +2682,7 @@
       <w:tr>
         <w:tc>
           <w:tcPr/>
-          <w:bookmarkStart w:id="61" w:name="tbl-scrmodstab"/>
+          <w:bookmarkStart w:id="65" w:name="tbl-scrmodstab"/>
           <w:p>
             <w:pPr>
               <w:jc w:val="center"/>
@@ -3773,7 +3871,7 @@
               </w:tc>
             </w:tr>
           </w:tbl>
-          <w:bookmarkEnd w:id="61"/>
+          <w:bookmarkEnd w:id="65"/>
         </w:tc>
       </w:tr>
     </w:tbl>
@@ -3795,7 +3893,7 @@
       <w:tr>
         <w:tc>
           <w:tcPr/>
-          <w:bookmarkStart w:id="62" w:name="tbl-spmodstab"/>
+          <w:bookmarkStart w:id="66" w:name="tbl-spmodstab"/>
           <w:p>
             <w:pPr>
               <w:jc w:val="center"/>
@@ -5418,7 +5516,7 @@
               </w:tc>
             </w:tr>
           </w:tbl>
-          <w:bookmarkEnd w:id="62"/>
+          <w:bookmarkEnd w:id="66"/>
         </w:tc>
       </w:tr>
     </w:tbl>
@@ -5440,7 +5538,7 @@
       <w:tr>
         <w:tc>
           <w:tcPr/>
-          <w:bookmarkStart w:id="63" w:name="tbl-slopetab"/>
+          <w:bookmarkStart w:id="67" w:name="tbl-slopetab"/>
           <w:p>
             <w:pPr>
               <w:jc w:val="center"/>
@@ -9889,7 +9987,7 @@
               </w:tc>
             </w:tr>
           </w:tbl>
-          <w:bookmarkEnd w:id="63"/>
+          <w:bookmarkEnd w:id="67"/>
         </w:tc>
       </w:tr>
     </w:tbl>
@@ -9898,8 +9996,8 @@
         <w:br w:type="page"/>
       </w:r>
     </w:p>
-    <w:bookmarkEnd w:id="64"/>
-    <w:bookmarkStart w:id="66" w:name="data-availability"/>
+    <w:bookmarkEnd w:id="68"/>
+    <w:bookmarkStart w:id="70" w:name="data-availability"/>
     <w:p>
       <w:pPr>
         <w:pStyle w:val="Heading2"/>
@@ -9918,7 +10016,7 @@
       <w:r>
         <w:t xml:space="preserve"> </w:t>
       </w:r>
-      <w:hyperlink r:id="rId65">
+      <w:hyperlink r:id="rId69">
         <w:r>
           <w:rPr>
             <w:rStyle w:val="Hyperlink"/>
@@ -9930,8 +10028,8 @@
         <w:t xml:space="preserve">.</w:t>
       </w:r>
     </w:p>
-    <w:bookmarkEnd w:id="66"/>
-    <w:bookmarkStart w:id="67" w:name="acknowledgments"/>
+    <w:bookmarkEnd w:id="70"/>
+    <w:bookmarkStart w:id="71" w:name="acknowledgments"/>
     <w:p>
       <w:pPr>
         <w:pStyle w:val="Heading2"/>
@@ -9940,8 +10038,8 @@
         <w:t xml:space="preserve">Acknowledgments</w:t>
       </w:r>
     </w:p>
-    <w:bookmarkEnd w:id="67"/>
-    <w:bookmarkStart w:id="76" w:name="references"/>
+    <w:bookmarkEnd w:id="71"/>
+    <w:bookmarkStart w:id="80" w:name="references"/>
     <w:p>
       <w:pPr>
         <w:pStyle w:val="Heading2"/>
@@ -9950,8 +10048,8 @@
         <w:t xml:space="preserve">References</w:t>
       </w:r>
     </w:p>
-    <w:bookmarkStart w:id="75" w:name="refs"/>
-    <w:bookmarkStart w:id="69" w:name="ref-bates15"/>
+    <w:bookmarkStart w:id="79" w:name="refs"/>
+    <w:bookmarkStart w:id="73" w:name="ref-bates15"/>
     <w:p>
       <w:pPr>
         <w:pStyle w:val="Bibliography"/>
@@ -9987,7 +10085,7 @@
       <w:r>
         <w:t xml:space="preserve"> </w:t>
       </w:r>
-      <w:hyperlink r:id="rId68">
+      <w:hyperlink r:id="rId72">
         <w:r>
           <w:rPr>
             <w:rStyle w:val="Hyperlink"/>
@@ -9999,8 +10097,8 @@
         <w:t xml:space="preserve">.</w:t>
       </w:r>
     </w:p>
-    <w:bookmarkEnd w:id="69"/>
-    <w:bookmarkStart w:id="70" w:name="ref-braun1965"/>
+    <w:bookmarkEnd w:id="73"/>
+    <w:bookmarkStart w:id="74" w:name="ref-braun1965"/>
     <w:p>
       <w:pPr>
         <w:pStyle w:val="Bibliography"/>
@@ -10022,8 +10120,8 @@
         <w:t xml:space="preserve">. London: Hafner Publishing Company.</w:t>
       </w:r>
     </w:p>
-    <w:bookmarkEnd w:id="70"/>
-    <w:bookmarkStart w:id="72" w:name="ref-rdct2025"/>
+    <w:bookmarkEnd w:id="74"/>
+    <w:bookmarkStart w:id="76" w:name="ref-rdct2025"/>
     <w:p>
       <w:pPr>
         <w:pStyle w:val="Bibliography"/>
@@ -10034,7 +10132,7 @@
       <w:r>
         <w:t xml:space="preserve"> </w:t>
       </w:r>
-      <w:hyperlink r:id="rId71">
+      <w:hyperlink r:id="rId75">
         <w:r>
           <w:rPr>
             <w:rStyle w:val="Hyperlink"/>
@@ -10048,8 +10146,8 @@
         <w:t xml:space="preserve">. Vienna, Austria: R Foundation for Statistical Computing.</w:t>
       </w:r>
     </w:p>
-    <w:bookmarkEnd w:id="72"/>
-    <w:bookmarkStart w:id="74" w:name="ref-wickham2019"/>
+    <w:bookmarkEnd w:id="76"/>
+    <w:bookmarkStart w:id="78" w:name="ref-wickham2019"/>
     <w:p>
       <w:pPr>
         <w:pStyle w:val="Bibliography"/>
@@ -10085,7 +10183,7 @@
       <w:r>
         <w:t xml:space="preserve"> </w:t>
       </w:r>
-      <w:hyperlink r:id="rId73">
+      <w:hyperlink r:id="rId77">
         <w:r>
           <w:rPr>
             <w:rStyle w:val="Hyperlink"/>
@@ -10097,9 +10195,9 @@
         <w:t xml:space="preserve">.</w:t>
       </w:r>
     </w:p>
-    <w:bookmarkEnd w:id="74"/>
-    <w:bookmarkEnd w:id="75"/>
-    <w:bookmarkEnd w:id="76"/>
+    <w:bookmarkEnd w:id="78"/>
+    <w:bookmarkEnd w:id="79"/>
+    <w:bookmarkEnd w:id="80"/>
     <w:sectPr>
       <w:footerReference r:id="rId9" w:type="default"/>
       <w:pgSz w:h="15840" w:w="12240"/>

</xml_diff>

<commit_message>
add leave one group out analysis, refactor methods to sep R files
</commit_message>
<xml_diff>
--- a/manu-draft.docx
+++ b/manu-draft.docx
@@ -320,7 +320,7 @@
         </m:sSup>
       </m:oMath>
       <w:r>
-        <w:t xml:space="preserve">) placed in or near the larger quadrat. Throughout this paper, the training locations are referred to as transects, although the transects in the actual monitoring after training are true transects often extending hundreds of meters from the shoreline into the bay.</w:t>
+        <w:t xml:space="preserve">) placed in or near the larger quadrat. Additional ancillary information is also collected (e.g., epiphyte load, leaf condition, sediment type, etc.), although it is not considered for the scoring. Throughout this paper the training locations are referred to as transects, whereas the transects in the actual monitoring that occurs after training are true transects often extending hundreds of meters from the shoreline into the bay.</w:t>
       </w:r>
     </w:p>
     <w:bookmarkStart w:id="38" w:name="scoring"/>
@@ -345,7 +345,7 @@
         <w:pStyle w:val="BodyText"/>
       </w:pPr>
       <w:r>
-        <w:t xml:space="preserve">All scores were first calculated at the smallest scale of species/metric/location, then scaled up to a metric/location score, then finally summed to a metric score. Three scores are assigned to each group for the abundance, blade length, and short shoot density metrics. The total score is a simple average of the metric scores. The entire process to score an individual group in a given year includes ten steps, as shown in</w:t>
+        <w:t xml:space="preserve">All scores were first calculated at the smallest scale of species/metric/location, then scaled up to a species/metric score, then finally summed to a metric score. Three scores are assigned to each group for the abundance, blade length, and short shoot density metrics. The total score is a simple average of the metric scores. The entire process to score an individual group in a given year includes ten steps, as shown in</w:t>
       </w:r>
       <w:r>
         <w:t xml:space="preserve"> </w:t>
@@ -1131,7 +1131,7 @@
         <w:t xml:space="preserve"> </w:t>
       </w:r>
       <w:r>
-        <w:t xml:space="preserve">of estimates across all groups for that sepcies at that transect (</w:t>
+        <w:t xml:space="preserve">of estimates across all groups for that species at that transect (</w:t>
       </w:r>
       <m:oMath>
         <m:sSub>
@@ -1157,7 +1157,41 @@
         </m:sSub>
       </m:oMath>
       <w:r>
-        <w:t xml:space="preserve">). The weighted average for the species and metric that combines the differences across transects is then:</w:t>
+        <w:t xml:space="preserve">). One minor difference for the short shoot density metric is that the species, transect weights in</w:t>
+      </w:r>
+      <w:r>
+        <w:t xml:space="preserve"> </w:t>
+      </w:r>
+      <w:hyperlink w:anchor="eq-weightsd">
+        <w:r>
+          <w:rPr>
+            <w:rStyle w:val="Hyperlink"/>
+          </w:rPr>
+          <w:t xml:space="preserve">Equation 4</w:t>
+        </w:r>
+      </w:hyperlink>
+      <w:r>
+        <w:t xml:space="preserve"> </w:t>
+      </w:r>
+      <w:r>
+        <w:t xml:space="preserve">are calculated using the coefficient of variation, following similar reasoning as using the symmetric difference in</w:t>
+      </w:r>
+      <w:r>
+        <w:t xml:space="preserve"> </w:t>
+      </w:r>
+      <w:hyperlink w:anchor="eq-dst2">
+        <w:r>
+          <w:rPr>
+            <w:rStyle w:val="Hyperlink"/>
+          </w:rPr>
+          <w:t xml:space="preserve">Equation 2</w:t>
+        </w:r>
+      </w:hyperlink>
+      <w:r>
+        <w:t xml:space="preserve"> </w:t>
+      </w:r>
+      <w:r>
+        <w:t xml:space="preserve">described above. The weighted average for the species and metric that combines the differences across transects is then:</w:t>
       </w:r>
     </w:p>
     <w:p>
@@ -2005,7 +2039,7 @@
         <w:pStyle w:val="FirstParagraph"/>
       </w:pPr>
       <w:r>
-        <w:t xml:space="preserve">The scoring methods were evaluated to assess robustness to group changes over time and sensitivity to</w:t>
+        <w:t xml:space="preserve">The scoring methods were evaluated to assess robustness to site or group changes over time and sensitivity to</w:t>
       </w:r>
       <w:r>
         <w:t xml:space="preserve"> </w:t>
@@ -2021,7 +2055,7 @@
         <w:t xml:space="preserve"> </w:t>
       </w:r>
       <w:r>
-        <w:t xml:space="preserve">decisions. First, all scores were recalculated for each year after removing each group sequentially following a</w:t>
+        <w:t xml:space="preserve">decisions. First, all scores were recalculated for each year after removing each location or group sequentially following a</w:t>
       </w:r>
       <w:r>
         <w:t xml:space="preserve"> </w:t>
@@ -2033,7 +2067,7 @@
         <w:t xml:space="preserve"> </w:t>
       </w:r>
       <w:r>
-        <w:t xml:space="preserve">approach since the core of the method relies on averages as group consensus. The intent was to demonstrate that overall scores did not vary considerably based on inclusion or exclusion of individual groups. The recalculated scores were compared to those using all groups with the expectation that results should be similar.</w:t>
+        <w:t xml:space="preserve">approach since the core of the method relies on averages across transects as group consensus. The intent was to demonstrate that overall scores did not vary considerably based on inclusion or exclusion of individual sites or groups. The recalculated scores were compared to those using all sites or groups in a year with the expectation that results should be similar.</w:t>
       </w:r>
     </w:p>
     <w:p>
@@ -2127,13 +2161,22 @@
     </w:p>
     <w:bookmarkEnd w:id="40"/>
     <w:bookmarkEnd w:id="41"/>
-    <w:bookmarkStart w:id="42" w:name="results"/>
+    <w:bookmarkStart w:id="43" w:name="results"/>
     <w:p>
       <w:pPr>
         <w:pStyle w:val="Heading2"/>
       </w:pPr>
       <w:r>
         <w:t xml:space="preserve">3 Results</w:t>
+      </w:r>
+    </w:p>
+    <w:bookmarkStart w:id="42" w:name="scoring-1"/>
+    <w:p>
+      <w:pPr>
+        <w:pStyle w:val="Heading3"/>
+      </w:pPr>
+      <w:r>
+        <w:t xml:space="preserve">3.1 Scoring</w:t>
       </w:r>
     </w:p>
     <w:p>
@@ -2141,7 +2184,7 @@
         <w:pStyle w:val="FirstParagraph"/>
       </w:pPr>
       <w:r>
-        <w:t xml:space="preserve">robustness of method - year period for calibration of score floor, leave one out</w:t>
+        <w:t xml:space="preserve">The methods described above were applied to every group that participated in the training from 2020 to 2026, producing 42 total assessments. An average of six groups participated each year. Only two groups participated all seven years, whereas three groups only missed one year of training. Although all groups were used for the scoring process, two groups that only participated in three or less years were removed from the assessment of scores over time.</w:t>
       </w:r>
     </w:p>
     <w:p>
@@ -2149,7 +2192,7 @@
         <w:pStyle w:val="BodyText"/>
       </w:pPr>
       <w:r>
-        <w:t xml:space="preserve">group scores</w:t>
+        <w:t xml:space="preserve">use trndat to identify number of plots/transects across years - consensus species list - abundance changes, though note that transects were selected to cover a variation in seagrass abundance/diversity and were not randomly selected. Maybe have a table of species over time with x marks showing if they were part of the consensus list?</w:t>
       </w:r>
     </w:p>
     <w:p>
@@ -2157,11 +2200,28 @@
         <w:pStyle w:val="BodyText"/>
       </w:pPr>
       <w:r>
+        <w:t xml:space="preserve">robustness of method - year period for calibration of score floor, leave one out</w:t>
+      </w:r>
+    </w:p>
+    <w:p>
+      <w:pPr>
+        <w:pStyle w:val="BodyText"/>
+      </w:pPr>
+      <w:r>
+        <w:t xml:space="preserve">group scores</w:t>
+      </w:r>
+    </w:p>
+    <w:p>
+      <w:pPr>
+        <w:pStyle w:val="BodyText"/>
+      </w:pPr>
+      <w:r>
         <w:t xml:space="preserve">improving scores over time</w:t>
       </w:r>
     </w:p>
     <w:bookmarkEnd w:id="42"/>
-    <w:bookmarkStart w:id="43" w:name="discussion"/>
+    <w:bookmarkEnd w:id="43"/>
+    <w:bookmarkStart w:id="44" w:name="discussion"/>
     <w:p>
       <w:pPr>
         <w:pStyle w:val="Heading2"/>
@@ -2215,8 +2275,8 @@
         <w:br w:type="page"/>
       </w:r>
     </w:p>
-    <w:bookmarkEnd w:id="43"/>
-    <w:bookmarkStart w:id="64" w:name="figures"/>
+    <w:bookmarkEnd w:id="44"/>
+    <w:bookmarkStart w:id="65" w:name="figures"/>
     <w:p>
       <w:pPr>
         <w:pStyle w:val="Heading2"/>
@@ -2238,7 +2298,7 @@
       <w:tr>
         <w:tc>
           <w:tcPr/>
-          <w:bookmarkStart w:id="47" w:name="fig-scoring_process"/>
+          <w:bookmarkStart w:id="48" w:name="fig-scoring_process"/>
           <w:p>
             <w:pPr>
               <w:pStyle w:val="Compact"/>
@@ -2249,18 +2309,18 @@
                 <wp:inline>
                   <wp:extent cx="5943600" cy="3962400"/>
                   <wp:effectExtent b="0" l="0" r="0" t="0"/>
-                  <wp:docPr descr="" title="" id="45" name="Picture"/>
+                  <wp:docPr descr="" title="" id="46" name="Picture"/>
                   <a:graphic>
                     <a:graphicData uri="http://schemas.openxmlformats.org/drawingml/2006/picture">
                       <pic:pic>
                         <pic:nvPicPr>
-                          <pic:cNvPr descr="figs/scoring_process.png" id="46" name="Picture"/>
+                          <pic:cNvPr descr="figs/scoring_process.png" id="47" name="Picture"/>
                           <pic:cNvPicPr>
                             <a:picLocks noChangeArrowheads="1" noChangeAspect="1"/>
                           </pic:cNvPicPr>
                         </pic:nvPicPr>
                         <pic:blipFill>
-                          <a:blip r:embed="rId44"/>
+                          <a:blip r:embed="rId45"/>
                           <a:stretch>
                             <a:fillRect/>
                           </a:stretch>
@@ -2300,7 +2360,7 @@
               <w:t xml:space="preserve">Fig. 1: Flowchart showing the scoring process from steps 1 to 10 for a single group in a given year. Step 3 involves all groups in the focal year and step 8 is a historical baseline from all groups for a set period of past trainings.</w:t>
             </w:r>
           </w:p>
-          <w:bookmarkEnd w:id="47"/>
+          <w:bookmarkEnd w:id="48"/>
         </w:tc>
       </w:tr>
     </w:tbl>
@@ -2322,7 +2382,7 @@
       <w:tr>
         <w:tc>
           <w:tcPr/>
-          <w:bookmarkStart w:id="51" w:name="fig-reportcard"/>
+          <w:bookmarkStart w:id="52" w:name="fig-reportcard"/>
           <w:p>
             <w:pPr>
               <w:pStyle w:val="Compact"/>
@@ -2333,18 +2393,18 @@
                 <wp:inline>
                   <wp:extent cx="5943600" cy="3776360"/>
                   <wp:effectExtent b="0" l="0" r="0" t="0"/>
-                  <wp:docPr descr="" title="" id="49" name="Picture"/>
+                  <wp:docPr descr="" title="" id="50" name="Picture"/>
                   <a:graphic>
                     <a:graphicData uri="http://schemas.openxmlformats.org/drawingml/2006/picture">
                       <pic:pic>
                         <pic:nvPicPr>
-                          <pic:cNvPr descr="figs/reportcard.png" id="50" name="Picture"/>
+                          <pic:cNvPr descr="figs/reportcard.png" id="51" name="Picture"/>
                           <pic:cNvPicPr>
                             <a:picLocks noChangeArrowheads="1" noChangeAspect="1"/>
                           </pic:cNvPicPr>
                         </pic:nvPicPr>
                         <pic:blipFill>
-                          <a:blip r:embed="rId48"/>
+                          <a:blip r:embed="rId49"/>
                           <a:stretch>
                             <a:fillRect/>
                           </a:stretch>
@@ -2384,7 +2444,7 @@
               <w:t xml:space="preserve">Fig. 2: Landing page for a group’s annual report card showing the overall score (top left), metric scores (bottom row), and barplots of deviations for each species used to calculate the metric scores. Also available is a summary of results for each species at each transect and an additional tab with resources on how to improve the scores.</w:t>
             </w:r>
           </w:p>
-          <w:bookmarkEnd w:id="51"/>
+          <w:bookmarkEnd w:id="52"/>
         </w:tc>
       </w:tr>
     </w:tbl>
@@ -2406,7 +2466,7 @@
       <w:tr>
         <w:tc>
           <w:tcPr/>
-          <w:bookmarkStart w:id="55" w:name="fig-leaveoneout"/>
+          <w:bookmarkStart w:id="56" w:name="fig-leaveoneout"/>
           <w:p>
             <w:pPr>
               <w:pStyle w:val="Compact"/>
@@ -2415,20 +2475,20 @@
             <w:r>
               <w:drawing>
                 <wp:inline>
-                  <wp:extent cx="5943600" cy="4457699"/>
+                  <wp:extent cx="5943600" cy="8172450"/>
                   <wp:effectExtent b="0" l="0" r="0" t="0"/>
-                  <wp:docPr descr="" title="" id="53" name="Picture"/>
+                  <wp:docPr descr="" title="" id="54" name="Picture"/>
                   <a:graphic>
                     <a:graphicData uri="http://schemas.openxmlformats.org/drawingml/2006/picture">
                       <pic:pic>
                         <pic:nvPicPr>
-                          <pic:cNvPr descr="figs/leaveoneout.png" id="54" name="Picture"/>
+                          <pic:cNvPr descr="figs/leaveoneout.png" id="55" name="Picture"/>
                           <pic:cNvPicPr>
                             <a:picLocks noChangeArrowheads="1" noChangeAspect="1"/>
                           </pic:cNvPicPr>
                         </pic:nvPicPr>
                         <pic:blipFill>
-                          <a:blip r:embed="rId52"/>
+                          <a:blip r:embed="rId53"/>
                           <a:stretch>
                             <a:fillRect/>
                           </a:stretch>
@@ -2436,7 +2496,7 @@
                         <pic:spPr bwMode="auto">
                           <a:xfrm>
                             <a:off x="0" y="0"/>
-                            <a:ext cx="5943600" cy="4457699"/>
+                            <a:ext cx="5943600" cy="8172450"/>
                           </a:xfrm>
                           <a:prstGeom prst="rect">
                             <a:avLst/>
@@ -2465,7 +2525,7 @@
               <w:pStyle w:val="ImageCaption"/>
             </w:pPr>
             <w:r>
-              <w:t xml:space="preserve">Fig. 3: Comparison of raw deviations (top row) and scores (bottom row) for each of three metrics following a leave-one-site-out analysis across all years. The values on the y-axis represent the newly calculated raw deviations or scores after removing one site for each of all sampling years, repeated until each site was removed once. The x-axis shows the original full-sample value for comparison. Points are colored by year. The</w:t>
+              <w:t xml:space="preserve">Fig. 3: Comparison of raw deviations (top row) and scores (bottom row) for each of three metrics following a leave-one-out analysis for (a) sites and (b) groups across all years. The values on the y-axis represent the newly calculated raw deviations or scores after removing one site or group for each of all sampling years, repeated until each site or group was removed once. The x-axis shows the original full-sample value for comparison. Points are colored by year. The</w:t>
             </w:r>
             <w:r>
               <w:t xml:space="preserve"> </w:t>
@@ -2479,10 +2539,10 @@
               <w:t xml:space="preserve"> </w:t>
             </w:r>
             <w:r>
-              <w:t xml:space="preserve">values represent the correlations between the recalculated values after removing one site and the full values with all sites. The dashed lines are 1:1 relationships.</w:t>
+              <w:t xml:space="preserve">values represent the correlations between the recalculated values after removing one site/group and the full values with all sites/groups. The dashed lines are 1:1 relationships.</w:t>
             </w:r>
           </w:p>
-          <w:bookmarkEnd w:id="55"/>
+          <w:bookmarkEnd w:id="56"/>
         </w:tc>
       </w:tr>
     </w:tbl>
@@ -2504,7 +2564,7 @@
       <w:tr>
         <w:tc>
           <w:tcPr/>
-          <w:bookmarkStart w:id="59" w:name="fig-calsens"/>
+          <w:bookmarkStart w:id="60" w:name="fig-calsens"/>
           <w:p>
             <w:pPr>
               <w:pStyle w:val="Compact"/>
@@ -2515,18 +2575,18 @@
                 <wp:inline>
                   <wp:extent cx="5504749" cy="5504749"/>
                   <wp:effectExtent b="0" l="0" r="0" t="0"/>
-                  <wp:docPr descr="" title="" id="57" name="Picture"/>
+                  <wp:docPr descr="" title="" id="58" name="Picture"/>
                   <a:graphic>
                     <a:graphicData uri="http://schemas.openxmlformats.org/drawingml/2006/picture">
                       <pic:pic>
                         <pic:nvPicPr>
-                          <pic:cNvPr descr="figs/calsens.png" id="58" name="Picture"/>
+                          <pic:cNvPr descr="figs/calsens.png" id="59" name="Picture"/>
                           <pic:cNvPicPr>
                             <a:picLocks noChangeArrowheads="1" noChangeAspect="1"/>
                           </pic:cNvPicPr>
                         </pic:nvPicPr>
                         <pic:blipFill>
-                          <a:blip r:embed="rId56"/>
+                          <a:blip r:embed="rId57"/>
                           <a:stretch>
                             <a:fillRect/>
                           </a:stretch>
@@ -2566,7 +2626,7 @@
               <w:t xml:space="preserve">Fig. 4: Sensitivity of the calculated floor for the metric scores based on length of the calibration period. Different calibration periods of two to six years from the beginning of the period of record were evaluated and are shown by point color. The black line is the mean floor across calibration periods for each year and metric. Points are jittered on the x-axis within each year.</w:t>
             </w:r>
           </w:p>
-          <w:bookmarkEnd w:id="59"/>
+          <w:bookmarkEnd w:id="60"/>
         </w:tc>
       </w:tr>
     </w:tbl>
@@ -2588,7 +2648,7 @@
       <w:tr>
         <w:tc>
           <w:tcPr/>
-          <w:bookmarkStart w:id="63" w:name="fig-scrdevmods"/>
+          <w:bookmarkStart w:id="64" w:name="fig-scrdevmods"/>
           <w:p>
             <w:pPr>
               <w:pStyle w:val="Compact"/>
@@ -2599,18 +2659,18 @@
                 <wp:inline>
                   <wp:extent cx="5943600" cy="3512127"/>
                   <wp:effectExtent b="0" l="0" r="0" t="0"/>
-                  <wp:docPr descr="" title="" id="61" name="Picture"/>
+                  <wp:docPr descr="" title="" id="62" name="Picture"/>
                   <a:graphic>
                     <a:graphicData uri="http://schemas.openxmlformats.org/drawingml/2006/picture">
                       <pic:pic>
                         <pic:nvPicPr>
-                          <pic:cNvPr descr="figs/scrdevmods.png" id="62" name="Picture"/>
+                          <pic:cNvPr descr="figs/scrdevmods.png" id="63" name="Picture"/>
                           <pic:cNvPicPr>
                             <a:picLocks noChangeArrowheads="1" noChangeAspect="1"/>
                           </pic:cNvPicPr>
                         </pic:nvPicPr>
                         <pic:blipFill>
-                          <a:blip r:embed="rId60"/>
+                          <a:blip r:embed="rId61"/>
                           <a:stretch>
                             <a:fillRect/>
                           </a:stretch>
@@ -2650,7 +2710,7 @@
               <w:t xml:space="preserve">Fig. 5: Results of mixed-effects models comparing group scores (top row) and absolute deviations (bottom row) over time. The models in the top row evaluate scores as a function of time with a random group effect, whereas the models in the bottom row evaluate the absolute deviation of each group’s reported value from the cross-group consensus (true) value, with random effects for species and group. Solid lines show the overall group or group/species means and the dashed lines show individual effects for group or group by species combinations. The bottom right plot (Short Shoot Density) is a singular fit with both species and group random-intercept variances estimated as zero, so only the fixed-effect trend is shown. None of the relationships are significant (ns: not significant).</w:t>
             </w:r>
           </w:p>
-          <w:bookmarkEnd w:id="63"/>
+          <w:bookmarkEnd w:id="64"/>
         </w:tc>
       </w:tr>
     </w:tbl>
@@ -2659,8 +2719,8 @@
         <w:br w:type="page"/>
       </w:r>
     </w:p>
-    <w:bookmarkEnd w:id="64"/>
-    <w:bookmarkStart w:id="68" w:name="tables"/>
+    <w:bookmarkEnd w:id="65"/>
+    <w:bookmarkStart w:id="69" w:name="tables"/>
     <w:p>
       <w:pPr>
         <w:pStyle w:val="Heading2"/>
@@ -2682,7 +2742,7 @@
       <w:tr>
         <w:tc>
           <w:tcPr/>
-          <w:bookmarkStart w:id="65" w:name="tbl-scrmodstab"/>
+          <w:bookmarkStart w:id="66" w:name="tbl-scrmodstab"/>
           <w:p>
             <w:pPr>
               <w:jc w:val="center"/>
@@ -3871,7 +3931,7 @@
               </w:tc>
             </w:tr>
           </w:tbl>
-          <w:bookmarkEnd w:id="65"/>
+          <w:bookmarkEnd w:id="66"/>
         </w:tc>
       </w:tr>
     </w:tbl>
@@ -3893,7 +3953,7 @@
       <w:tr>
         <w:tc>
           <w:tcPr/>
-          <w:bookmarkStart w:id="66" w:name="tbl-spmodstab"/>
+          <w:bookmarkStart w:id="67" w:name="tbl-spmodstab"/>
           <w:p>
             <w:pPr>
               <w:jc w:val="center"/>
@@ -5516,7 +5576,7 @@
               </w:tc>
             </w:tr>
           </w:tbl>
-          <w:bookmarkEnd w:id="66"/>
+          <w:bookmarkEnd w:id="67"/>
         </w:tc>
       </w:tr>
     </w:tbl>
@@ -5538,7 +5598,7 @@
       <w:tr>
         <w:tc>
           <w:tcPr/>
-          <w:bookmarkStart w:id="67" w:name="tbl-slopetab"/>
+          <w:bookmarkStart w:id="68" w:name="tbl-slopetab"/>
           <w:p>
             <w:pPr>
               <w:jc w:val="center"/>
@@ -9987,7 +10047,7 @@
               </w:tc>
             </w:tr>
           </w:tbl>
-          <w:bookmarkEnd w:id="67"/>
+          <w:bookmarkEnd w:id="68"/>
         </w:tc>
       </w:tr>
     </w:tbl>
@@ -9996,8 +10056,8 @@
         <w:br w:type="page"/>
       </w:r>
     </w:p>
-    <w:bookmarkEnd w:id="68"/>
-    <w:bookmarkStart w:id="70" w:name="data-availability"/>
+    <w:bookmarkEnd w:id="69"/>
+    <w:bookmarkStart w:id="71" w:name="data-availability"/>
     <w:p>
       <w:pPr>
         <w:pStyle w:val="Heading2"/>
@@ -10016,7 +10076,7 @@
       <w:r>
         <w:t xml:space="preserve"> </w:t>
       </w:r>
-      <w:hyperlink r:id="rId69">
+      <w:hyperlink r:id="rId70">
         <w:r>
           <w:rPr>
             <w:rStyle w:val="Hyperlink"/>
@@ -10028,8 +10088,8 @@
         <w:t xml:space="preserve">.</w:t>
       </w:r>
     </w:p>
-    <w:bookmarkEnd w:id="70"/>
-    <w:bookmarkStart w:id="71" w:name="acknowledgments"/>
+    <w:bookmarkEnd w:id="71"/>
+    <w:bookmarkStart w:id="72" w:name="acknowledgments"/>
     <w:p>
       <w:pPr>
         <w:pStyle w:val="Heading2"/>
@@ -10038,8 +10098,8 @@
         <w:t xml:space="preserve">Acknowledgments</w:t>
       </w:r>
     </w:p>
-    <w:bookmarkEnd w:id="71"/>
-    <w:bookmarkStart w:id="80" w:name="references"/>
+    <w:bookmarkEnd w:id="72"/>
+    <w:bookmarkStart w:id="81" w:name="references"/>
     <w:p>
       <w:pPr>
         <w:pStyle w:val="Heading2"/>
@@ -10048,8 +10108,8 @@
         <w:t xml:space="preserve">References</w:t>
       </w:r>
     </w:p>
-    <w:bookmarkStart w:id="79" w:name="refs"/>
-    <w:bookmarkStart w:id="73" w:name="ref-bates15"/>
+    <w:bookmarkStart w:id="80" w:name="refs"/>
+    <w:bookmarkStart w:id="74" w:name="ref-bates15"/>
     <w:p>
       <w:pPr>
         <w:pStyle w:val="Bibliography"/>
@@ -10085,7 +10145,7 @@
       <w:r>
         <w:t xml:space="preserve"> </w:t>
       </w:r>
-      <w:hyperlink r:id="rId72">
+      <w:hyperlink r:id="rId73">
         <w:r>
           <w:rPr>
             <w:rStyle w:val="Hyperlink"/>
@@ -10097,8 +10157,8 @@
         <w:t xml:space="preserve">.</w:t>
       </w:r>
     </w:p>
-    <w:bookmarkEnd w:id="73"/>
-    <w:bookmarkStart w:id="74" w:name="ref-braun1965"/>
+    <w:bookmarkEnd w:id="74"/>
+    <w:bookmarkStart w:id="75" w:name="ref-braun1965"/>
     <w:p>
       <w:pPr>
         <w:pStyle w:val="Bibliography"/>
@@ -10120,8 +10180,8 @@
         <w:t xml:space="preserve">. London: Hafner Publishing Company.</w:t>
       </w:r>
     </w:p>
-    <w:bookmarkEnd w:id="74"/>
-    <w:bookmarkStart w:id="76" w:name="ref-rdct2025"/>
+    <w:bookmarkEnd w:id="75"/>
+    <w:bookmarkStart w:id="77" w:name="ref-rdct2025"/>
     <w:p>
       <w:pPr>
         <w:pStyle w:val="Bibliography"/>
@@ -10132,7 +10192,7 @@
       <w:r>
         <w:t xml:space="preserve"> </w:t>
       </w:r>
-      <w:hyperlink r:id="rId75">
+      <w:hyperlink r:id="rId76">
         <w:r>
           <w:rPr>
             <w:rStyle w:val="Hyperlink"/>
@@ -10146,8 +10206,8 @@
         <w:t xml:space="preserve">. Vienna, Austria: R Foundation for Statistical Computing.</w:t>
       </w:r>
     </w:p>
-    <w:bookmarkEnd w:id="76"/>
-    <w:bookmarkStart w:id="78" w:name="ref-wickham2019"/>
+    <w:bookmarkEnd w:id="77"/>
+    <w:bookmarkStart w:id="79" w:name="ref-wickham2019"/>
     <w:p>
       <w:pPr>
         <w:pStyle w:val="Bibliography"/>
@@ -10183,7 +10243,7 @@
       <w:r>
         <w:t xml:space="preserve"> </w:t>
       </w:r>
-      <w:hyperlink r:id="rId77">
+      <w:hyperlink r:id="rId78">
         <w:r>
           <w:rPr>
             <w:rStyle w:val="Hyperlink"/>
@@ -10195,9 +10255,9 @@
         <w:t xml:space="preserve">.</w:t>
       </w:r>
     </w:p>
-    <w:bookmarkEnd w:id="78"/>
     <w:bookmarkEnd w:id="79"/>
     <w:bookmarkEnd w:id="80"/>
+    <w:bookmarkEnd w:id="81"/>
     <w:sectPr>
       <w:footerReference r:id="rId9" w:type="default"/>
       <w:pgSz w:h="15840" w:w="12240"/>

</xml_diff>

<commit_message>
rerun all with groups better identified, make trainsumtab
</commit_message>
<xml_diff>
--- a/manu-draft.docx
+++ b/manu-draft.docx
@@ -2184,7 +2184,7 @@
         <w:pStyle w:val="FirstParagraph"/>
       </w:pPr>
       <w:r>
-        <w:t xml:space="preserve">The methods described above were applied to every group that participated in the training from 2020 to 2026, producing 42 total assessments. An average of six groups participated each year. Only two groups participated all seven years, whereas three groups only missed one year of training. Although all groups were used for the scoring process, two groups that only participated in three or less years were removed from the assessment of scores over time.</w:t>
+        <w:t xml:space="preserve">The methods described above were applied to every group that participated in the training from 2020 to 2026, producing 51 total assessments. An average of seven groups participated each year. Only three groups participated all seven years, whereas three groups only missed one year of training. Although all groups were used for the scoring process, two groups that only participated in three or less years were removed from the assessment of scores over time.</w:t>
       </w:r>
     </w:p>
     <w:p>
@@ -2268,6 +2268,14 @@
       </w:pPr>
       <w:r>
         <w:t xml:space="preserve">attempts at discounting group differences by how variable they were between species. this was done for a species across transects, small sample sizes (e.g., a species at two or three transects) made this measure noisy and not a meaningful assessment of group consistency. Alternatively, the getween-group variation is a more meaningful measure of certainty, but it describes an entirely different source of variation.</w:t>
+      </w:r>
+    </w:p>
+    <w:p>
+      <w:pPr>
+        <w:pStyle w:val="FirstParagraph"/>
+      </w:pPr>
+      <w:r>
+        <w:t xml:space="preserve">Value of reproducible method, parameterized reports.</w:t>
       </w:r>
     </w:p>
     <w:p>
@@ -2525,7 +2533,7 @@
               <w:pStyle w:val="ImageCaption"/>
             </w:pPr>
             <w:r>
-              <w:t xml:space="preserve">Fig. 3: Comparison of raw deviations (top row) and scores (bottom row) for each of three metrics following a leave-one-out analysis for (a) sites and (b) groups across all years. The values on the y-axis represent the newly calculated raw deviations or scores after removing one site or group for each of all sampling years, repeated until each site or group was removed once. The x-axis shows the original full-sample value for comparison. Points are colored by year. The</w:t>
+              <w:t xml:space="preserve">Fig. 3: Comparison of raw deviations (rows 1 and 3) and scores (rows 2 and 4) for each of three metrics following a leave-one-out analysis for (a) sites and (b) groups across all years. The values on the y-axis represent the newly calculated raw deviations or scores after removing one site or group for each of all sampling years, repeated until each site or group was removed once. The x-axis shows the original full-sample value for comparison. Points are colored by year. The</w:t>
             </w:r>
             <w:r>
               <w:t xml:space="preserve"> </w:t>
@@ -2707,7 +2715,7 @@
               <w:pStyle w:val="ImageCaption"/>
             </w:pPr>
             <w:r>
-              <w:t xml:space="preserve">Fig. 5: Results of mixed-effects models comparing group scores (top row) and absolute deviations (bottom row) over time. The models in the top row evaluate scores as a function of time with a random group effect, whereas the models in the bottom row evaluate the absolute deviation of each group’s reported value from the cross-group consensus (true) value, with random effects for species and group. Solid lines show the overall group or group/species means and the dashed lines show individual effects for group or group by species combinations. The bottom right plot (Short Shoot Density) is a singular fit with both species and group random-intercept variances estimated as zero, so only the fixed-effect trend is shown. None of the relationships are significant (ns: not significant).</w:t>
+              <w:t xml:space="preserve">Fig. 5: Results of mixed-effects models comparing group scores (top row) and absolute deviations (bottom row) over time, restricted to groups with more than three years of participation. The models in the top row evaluate scores as a function of time with a random group effect, whereas the models in the bottom row evaluate the absolute deviation of each group’s reported value from the cross-group consensus (true) value, with random effects for species and group. Solid lines show the overall group or group/species means and the dashed lines show individual effects for group or group by species combinations. The Short Shoot Density plots in both rows are singular fits, with the group random-intercept variance (top) or both species and group random-intercept variances (bottom) estimated as zero, so only the fixed-effect trend is shown. None of the relationships are significant (ns: not significant).</w:t>
             </w:r>
           </w:p>
           <w:bookmarkEnd w:id="64"/>
@@ -2753,7 +2761,7 @@
               <w:pStyle w:val="ImageCaption"/>
             </w:pPr>
             <w:r>
-              <w:t xml:space="preserve">Table 1: Model summaries of metric score trends over time (year) by metric, with group as a random intercept. Group SD is the between group standard deviation. R² is shown for the marginal (fixed effects only) and conditional (fixed and random) effects. AIC: Akaike Information Criterion.</w:t>
+              <w:t xml:space="preserve">Table 1: Model summaries of metric score trends over time (year) by metric, with group as a random intercept, restricted to groups with more than three years of participation. Group SD is the between group standard deviation. R² is shown for the marginal (fixed effects only) and conditional (fixed and random) effects. Short Shoot Density is a singular fit (group random-intercept variance estimated as zero), so its conditional R² is undefined. AIC: Akaike Information Criterion.</w:t>
             </w:r>
           </w:p>
           <w:tbl xmlns:w="http://schemas.openxmlformats.org/wordprocessingml/2006/main" xmlns:r="http://schemas.openxmlformats.org/officeDocument/2006/relationships" xmlns:w14="http://schemas.microsoft.com/office/word/2010/wordml" xmlns:wp="http://schemas.openxmlformats.org/drawingml/2006/wordprocessingDrawing" xmlns:a="http://schemas.openxmlformats.org/drawingml/2006/main" xmlns:pic="http://schemas.openxmlformats.org/drawingml/2006/picture">
@@ -3153,7 +3161,7 @@
                       <w:szCs w:val="22"/>
                       <w:color w:val="000000"/>
                     </w:rPr>
-                    <w:t xml:space="preserve">-0.1 (-2.6, 2.3)</w:t>
+                    <w:t xml:space="preserve">-0.2 (-2.4, 1.9)</w:t>
                   </w:r>
                 </w:p>
               </w:tc>
@@ -3207,7 +3215,7 @@
                       <w:szCs w:val="22"/>
                       <w:color w:val="000000"/>
                     </w:rPr>
-                    <w:t xml:space="preserve">5.1</w:t>
+                    <w:t xml:space="preserve">6.8</w:t>
                   </w:r>
                 </w:p>
               </w:tc>
@@ -3261,7 +3269,7 @@
                       <w:szCs w:val="22"/>
                       <w:color w:val="000000"/>
                     </w:rPr>
-                    <w:t xml:space="preserve">0.00 / 0.11</w:t>
+                    <w:t xml:space="preserve">0.00 / 0.20</w:t>
                   </w:r>
                 </w:p>
               </w:tc>
@@ -3315,7 +3323,7 @@
                       <w:szCs w:val="22"/>
                       <w:color w:val="000000"/>
                     </w:rPr>
-                    <w:t xml:space="preserve">304.9</w:t>
+                    <w:t xml:space="preserve">361.4</w:t>
                   </w:r>
                 </w:p>
               </w:tc>
@@ -3428,7 +3436,7 @@
                       <w:szCs w:val="22"/>
                       <w:color w:val="000000"/>
                     </w:rPr>
-                    <w:t xml:space="preserve">1.3 (-0.2, 2.8)</w:t>
+                    <w:t xml:space="preserve">0.7 (-1.0, 2.3)</w:t>
                   </w:r>
                 </w:p>
               </w:tc>
@@ -3482,7 +3490,7 @@
                       <w:szCs w:val="22"/>
                       <w:color w:val="000000"/>
                     </w:rPr>
-                    <w:t xml:space="preserve">3.4</w:t>
+                    <w:t xml:space="preserve">1.6</w:t>
                   </w:r>
                 </w:p>
               </w:tc>
@@ -3536,7 +3544,7 @@
                       <w:szCs w:val="22"/>
                       <w:color w:val="000000"/>
                     </w:rPr>
-                    <w:t xml:space="preserve">0.07 / 0.18</w:t>
+                    <w:t xml:space="preserve">0.01 / 0.03</w:t>
                   </w:r>
                 </w:p>
               </w:tc>
@@ -3590,7 +3598,7 @@
                       <w:szCs w:val="22"/>
                       <w:color w:val="000000"/>
                     </w:rPr>
-                    <w:t xml:space="preserve">272.8</w:t>
+                    <w:t xml:space="preserve">338.3</w:t>
                   </w:r>
                 </w:p>
               </w:tc>
@@ -3703,7 +3711,7 @@
                       <w:szCs w:val="22"/>
                       <w:color w:val="000000"/>
                     </w:rPr>
-                    <w:t xml:space="preserve">-0.1 (-1.9, 1.9)</w:t>
+                    <w:t xml:space="preserve">-0.2 (-2.0, 1.6)</w:t>
                   </w:r>
                 </w:p>
               </w:tc>
@@ -3757,7 +3765,7 @@
                       <w:szCs w:val="22"/>
                       <w:color w:val="000000"/>
                     </w:rPr>
-                    <w:t xml:space="preserve">2.9</w:t>
+                    <w:t xml:space="preserve">0.0</w:t>
                   </w:r>
                 </w:p>
               </w:tc>
@@ -3811,7 +3819,7 @@
                       <w:szCs w:val="22"/>
                       <w:color w:val="000000"/>
                     </w:rPr>
-                    <w:t xml:space="preserve">0.00 / 0.06</w:t>
+                    <w:t xml:space="preserve">0.00 /  NA</w:t>
                   </w:r>
                 </w:p>
               </w:tc>
@@ -3865,7 +3873,7 @@
                       <w:szCs w:val="22"/>
                       <w:color w:val="000000"/>
                     </w:rPr>
-                    <w:t xml:space="preserve">286.8</w:t>
+                    <w:t xml:space="preserve">345.1</w:t>
                   </w:r>
                 </w:p>
               </w:tc>
@@ -3925,7 +3933,7 @@
                       <w:szCs w:val="22"/>
                       <w:color w:val="000000"/>
                     </w:rPr>
-                    <w:t xml:space="preserve">N = 37, Groups = 6 for all models.</w:t>
+                    <w:t xml:space="preserve">N = 44, Groups = 7 for all models.</w:t>
                   </w:r>
                 </w:p>
               </w:tc>
@@ -3964,7 +3972,7 @@
               <w:pStyle w:val="ImageCaption"/>
             </w:pPr>
             <w:r>
-              <w:t xml:space="preserve">Table 2: Model summaries of absolute deviation trends over time (year) by metric, with species and group as crossed random intercepts. Units are specific to the metric (Abundance: category positions, Blade Length: cm, Short Shoot Density: percent difference). Group SD is the between group standard deviation and species SD is the between species standard deviation. R² is shown for the marginal (fixed effects only) and conditional (fixed and random) effects. Short Shoot Density is a singular fit (both random-intercept variances estimated as zero), so its conditional R² is undefined. AIC: Akaike Information Criterion.</w:t>
+              <w:t xml:space="preserve">Table 2: Model summaries of absolute deviation trends over time (year) by metric, with species and group as crossed random intercepts, restricted to groups with more than three years of participation. Units are specific to the metric (Abundance: category positions, Blade Length: cm, Short Shoot Density: percent difference). Group SD is the between group standard deviation and species SD is the between species standard deviation. R² is shown for the marginal (fixed effects only) and conditional (fixed and random) effects. Short Shoot Density is a singular fit (both random-intercept variances estimated as zero), so its conditional R² is undefined. AIC: Akaike Information Criterion.</w:t>
             </w:r>
           </w:p>
           <w:tbl xmlns:w="http://schemas.openxmlformats.org/wordprocessingml/2006/main" xmlns:r="http://schemas.openxmlformats.org/officeDocument/2006/relationships" xmlns:w14="http://schemas.microsoft.com/office/word/2010/wordml" xmlns:wp="http://schemas.openxmlformats.org/drawingml/2006/wordprocessingDrawing" xmlns:a="http://schemas.openxmlformats.org/drawingml/2006/main" xmlns:pic="http://schemas.openxmlformats.org/drawingml/2006/picture">
@@ -4474,7 +4482,7 @@
                       <w:szCs w:val="18"/>
                       <w:color w:val="000000"/>
                     </w:rPr>
-                    <w:t xml:space="preserve">135</w:t>
+                    <w:t xml:space="preserve">141</w:t>
                   </w:r>
                 </w:p>
               </w:tc>
@@ -4528,7 +4536,7 @@
                       <w:szCs w:val="18"/>
                       <w:color w:val="000000"/>
                     </w:rPr>
-                    <w:t xml:space="preserve">-0.004 (-0.036, 0.030)</w:t>
+                    <w:t xml:space="preserve">-0.005 (-0.037, 0.027)</w:t>
                   </w:r>
                 </w:p>
               </w:tc>
@@ -4582,7 +4590,7 @@
                       <w:szCs w:val="18"/>
                       <w:color w:val="000000"/>
                     </w:rPr>
-                    <w:t xml:space="preserve">0.04</w:t>
+                    <w:t xml:space="preserve">0.06</w:t>
                   </w:r>
                 </w:p>
               </w:tc>
@@ -4636,7 +4644,7 @@
                       <w:szCs w:val="18"/>
                       <w:color w:val="000000"/>
                     </w:rPr>
-                    <w:t xml:space="preserve">0.04</w:t>
+                    <w:t xml:space="preserve">0.09</w:t>
                   </w:r>
                 </w:p>
               </w:tc>
@@ -4690,7 +4698,7 @@
                       <w:szCs w:val="18"/>
                       <w:color w:val="000000"/>
                     </w:rPr>
-                    <w:t xml:space="preserve">0.00 / 0.02</w:t>
+                    <w:t xml:space="preserve">0.00 / 0.08</w:t>
                   </w:r>
                 </w:p>
               </w:tc>
@@ -4744,7 +4752,7 @@
                       <w:szCs w:val="18"/>
                       <w:color w:val="000000"/>
                     </w:rPr>
-                    <w:t xml:space="preserve">129.4</w:t>
+                    <w:t xml:space="preserve">140.6</w:t>
                   </w:r>
                 </w:p>
               </w:tc>
@@ -4857,7 +4865,7 @@
                       <w:szCs w:val="18"/>
                       <w:color w:val="000000"/>
                     </w:rPr>
-                    <w:t xml:space="preserve">130</w:t>
+                    <w:t xml:space="preserve">135</w:t>
                   </w:r>
                 </w:p>
               </w:tc>
@@ -4911,7 +4919,7 @@
                       <w:szCs w:val="18"/>
                       <w:color w:val="000000"/>
                     </w:rPr>
-                    <w:t xml:space="preserve">-0.212 (-0.537, 0.109)</w:t>
+                    <w:t xml:space="preserve">-0.100 (-0.430, 0.224)</w:t>
                   </w:r>
                 </w:p>
               </w:tc>
@@ -4965,7 +4973,7 @@
                       <w:szCs w:val="18"/>
                       <w:color w:val="000000"/>
                     </w:rPr>
-                    <w:t xml:space="preserve">0.92</w:t>
+                    <w:t xml:space="preserve">0.74</w:t>
                   </w:r>
                 </w:p>
               </w:tc>
@@ -5019,7 +5027,7 @@
                       <w:szCs w:val="18"/>
                       <w:color w:val="000000"/>
                     </w:rPr>
-                    <w:t xml:space="preserve">1.54</w:t>
+                    <w:t xml:space="preserve">2.07</w:t>
                   </w:r>
                 </w:p>
               </w:tc>
@@ -5073,7 +5081,7 @@
                       <w:szCs w:val="18"/>
                       <w:color w:val="000000"/>
                     </w:rPr>
-                    <w:t xml:space="preserve">0.01 / 0.23</w:t>
+                    <w:t xml:space="preserve">0.00 / 0.28</w:t>
                   </w:r>
                 </w:p>
               </w:tc>
@@ -5127,7 +5135,7 @@
                       <w:szCs w:val="18"/>
                       <w:color w:val="000000"/>
                     </w:rPr>
-                    <w:t xml:space="preserve">702.3</w:t>
+                    <w:t xml:space="preserve">744.2</w:t>
                   </w:r>
                 </w:p>
               </w:tc>
@@ -5240,7 +5248,7 @@
                       <w:szCs w:val="18"/>
                       <w:color w:val="000000"/>
                     </w:rPr>
-                    <w:t xml:space="preserve">125</w:t>
+                    <w:t xml:space="preserve">129</w:t>
                   </w:r>
                 </w:p>
               </w:tc>
@@ -5294,7 +5302,7 @@
                       <w:szCs w:val="18"/>
                       <w:color w:val="000000"/>
                     </w:rPr>
-                    <w:t xml:space="preserve">0.015 (-0.023, 0.054)</w:t>
+                    <w:t xml:space="preserve">0.026 (-0.014, 0.065)</w:t>
                   </w:r>
                 </w:p>
               </w:tc>
@@ -5510,7 +5518,7 @@
                       <w:szCs w:val="18"/>
                       <w:color w:val="000000"/>
                     </w:rPr>
-                    <w:t xml:space="preserve">141.4</w:t>
+                    <w:t xml:space="preserve">161.5</w:t>
                   </w:r>
                 </w:p>
               </w:tc>
@@ -5570,7 +5578,7 @@
                       <w:szCs w:val="22"/>
                       <w:color w:val="000000"/>
                     </w:rPr>
-                    <w:t xml:space="preserve">Groups = 8, Species = 3 for all models. </w:t>
+                    <w:t xml:space="preserve">Groups = 7, Species = 3 for all models. </w:t>
                   </w:r>
                 </w:p>
               </w:tc>
@@ -5609,7 +5617,7 @@
               <w:pStyle w:val="ImageCaption"/>
             </w:pPr>
             <w:r>
-              <w:t xml:space="preserve">Table 3: Slopes of change over time (year) for raw absolute deviations of metrics, by species and training group (identities anonymized as A-F). Colors diverge at zero within each metric (red increasing, green decreasing), with the domain scaled separately per metric since the units differ (Abundance: category positions, Blade Length: cm, Short Shoot Density: percent difference).</w:t>
+              <w:t xml:space="preserve">Table 3: Slopes of change over time (year) for raw absolute deviations of metrics, by species and training group (identities anonymized as A-G; restricted to groups with more than three years of participation). Colors diverge at zero within each metric (red increasing, green decreasing), with the domain scaled separately per metric since the units differ (Abundance: category positions, Blade Length: cm, Short Shoot Density: percent difference).</w:t>
             </w:r>
           </w:p>
           <w:tbl xmlns:w="http://schemas.openxmlformats.org/wordprocessingml/2006/main" xmlns:r="http://schemas.openxmlformats.org/officeDocument/2006/relationships" xmlns:w14="http://schemas.microsoft.com/office/word/2010/wordml" xmlns:wp="http://schemas.openxmlformats.org/drawingml/2006/wordprocessingDrawing" xmlns:a="http://schemas.openxmlformats.org/drawingml/2006/main" xmlns:pic="http://schemas.openxmlformats.org/drawingml/2006/picture">
@@ -5627,6 +5635,7 @@
               <w:gridCol w:w="867"/>
               <w:gridCol w:w="867"/>
               <w:gridCol w:w="867"/>
+              <w:gridCol w:w="867"/>
             </w:tblGrid>
             <w:tr>
               <w:trPr>
@@ -5690,7 +5699,7 @@
               </w:tc>
               <w:tc>
                 <w:tcPr>
-                  <w:gridSpan w:val="6"/>
+                  <w:gridSpan w:val="7"/>
                   <w:tcBorders>
                     <w:bottom w:val="single" w:sz="12" w:space="0" w:color="666666"/>
                     <w:top w:val="single" w:sz="12" w:space="0" w:color="666666"/>
@@ -6181,6 +6190,60 @@
                   </w:r>
                 </w:p>
               </w:tc>
+              <w:tc>
+                <w:tcPr>
+                  <w:tcBorders>
+                    <w:bottom w:val="single" w:sz="12" w:space="0" w:color="666666"/>
+                    <w:top w:val="single" w:sz="12" w:space="0" w:color="666666"/>
+                    <w:left w:val="none" w:sz="0" w:space="0" w:color="000000"/>
+                    <w:right w:val="none" w:sz="0" w:space="0" w:color="000000"/>
+                  </w:tcBorders>
+                  <w:shd w:val="clear" w:color="auto" w:fill="FFFFFF"/>
+                  <w:tcMar>
+                    <w:top w:w="0" w:type="dxa"/>
+                    <w:bottom w:w="0" w:type="dxa"/>
+                    <w:left w:w="0" w:type="dxa"/>
+                    <w:right w:w="0" w:type="dxa"/>
+                  </w:tcMar>
+                  <w:vAlign w:val="center"/>
+                </w:tcPr>
+                <w:p>
+                  <w:pPr>
+                    <w:jc w:val="center"/>
+                    <w:pBdr>
+                      <w:bottom w:val="none" w:sz="0" w:space="0" w:color="000000"/>
+                      <w:top w:val="none" w:sz="0" w:space="0" w:color="000000"/>
+                      <w:left w:val="none" w:sz="0" w:space="0" w:color="000000"/>
+                      <w:right w:val="none" w:sz="0" w:space="0" w:color="000000"/>
+                    </w:pBdr>
+                    <w:spacing w:after="100" w:before="100" w:line="240"/>
+                    <w:ind w:left="100" w:right="100" w:firstLine="0" w:firstLineChars="0"/>
+                    <w:rPr>
+                      <w:rFonts w:ascii="Arial" w:hAnsi="Arial" w:eastAsia="Arial" w:cs="Arial"/>
+                      <w:i w:val="false"/>
+                      <w:b w:val="true"/>
+                      <w:u w:val="none"/>
+                      <w:strike w:val="false"/>
+                      <w:sz w:val="20"/>
+                      <w:szCs w:val="20"/>
+                      <w:color w:val="000000"/>
+                    </w:rPr>
+                  </w:pPr>
+                  <w:r xmlns:w="http://schemas.openxmlformats.org/wordprocessingml/2006/main" xmlns:wp="http://schemas.openxmlformats.org/drawingml/2006/wordprocessingDrawing" xmlns:r="http://schemas.openxmlformats.org/officeDocument/2006/relationships" xmlns:w14="http://schemas.microsoft.com/office/word/2010/wordml">
+                    <w:rPr>
+                      <w:rFonts w:ascii="Arial" w:hAnsi="Arial" w:eastAsia="Arial" w:cs="Arial"/>
+                      <w:i w:val="false"/>
+                      <w:b w:val="true"/>
+                      <w:u w:val="none"/>
+                      <w:strike w:val="false"/>
+                      <w:sz w:val="20"/>
+                      <w:szCs w:val="20"/>
+                      <w:color w:val="000000"/>
+                    </w:rPr>
+                    <w:t xml:space="preserve">G</w:t>
+                  </w:r>
+                </w:p>
+              </w:tc>
             </w:tr>
             <w:tr>
               <w:trPr>
@@ -6619,6 +6682,60 @@
                   </w:r>
                 </w:p>
               </w:tc>
+              <w:tc>
+                <w:tcPr>
+                  <w:tcBorders>
+                    <w:bottom w:val="none" w:sz="0" w:space="0" w:color="000000"/>
+                    <w:top w:val="single" w:sz="12" w:space="0" w:color="666666"/>
+                    <w:left w:val="none" w:sz="0" w:space="0" w:color="000000"/>
+                    <w:right w:val="none" w:sz="0" w:space="0" w:color="000000"/>
+                  </w:tcBorders>
+                  <w:shd w:val="clear" w:color="auto" w:fill="E9F0EA"/>
+                  <w:tcMar>
+                    <w:top w:w="0" w:type="dxa"/>
+                    <w:bottom w:w="0" w:type="dxa"/>
+                    <w:left w:w="0" w:type="dxa"/>
+                    <w:right w:w="0" w:type="dxa"/>
+                  </w:tcMar>
+                  <w:vAlign w:val="center"/>
+                </w:tcPr>
+                <w:p>
+                  <w:pPr>
+                    <w:jc w:val="center"/>
+                    <w:pBdr>
+                      <w:bottom w:val="none" w:sz="0" w:space="0" w:color="000000"/>
+                      <w:top w:val="none" w:sz="0" w:space="0" w:color="000000"/>
+                      <w:left w:val="none" w:sz="0" w:space="0" w:color="000000"/>
+                      <w:right w:val="none" w:sz="0" w:space="0" w:color="000000"/>
+                    </w:pBdr>
+                    <w:spacing w:after="100" w:before="100" w:line="240"/>
+                    <w:ind w:left="100" w:right="100" w:firstLine="0" w:firstLineChars="0"/>
+                    <w:rPr>
+                      <w:rFonts w:ascii="Arial" w:hAnsi="Arial" w:eastAsia="Arial" w:cs="Arial"/>
+                      <w:i w:val="false"/>
+                      <w:b w:val="false"/>
+                      <w:u w:val="none"/>
+                      <w:strike w:val="false"/>
+                      <w:sz w:val="20"/>
+                      <w:szCs w:val="20"/>
+                      <w:color w:val="000000"/>
+                    </w:rPr>
+                  </w:pPr>
+                  <w:r xmlns:w="http://schemas.openxmlformats.org/wordprocessingml/2006/main" xmlns:wp="http://schemas.openxmlformats.org/drawingml/2006/wordprocessingDrawing" xmlns:r="http://schemas.openxmlformats.org/officeDocument/2006/relationships" xmlns:w14="http://schemas.microsoft.com/office/word/2010/wordml">
+                    <w:rPr>
+                      <w:rFonts w:ascii="Arial" w:hAnsi="Arial" w:eastAsia="Arial" w:cs="Arial"/>
+                      <w:i w:val="false"/>
+                      <w:b w:val="false"/>
+                      <w:u w:val="none"/>
+                      <w:strike w:val="false"/>
+                      <w:sz w:val="20"/>
+                      <w:szCs w:val="20"/>
+                      <w:color w:val="000000"/>
+                    </w:rPr>
+                    <w:t xml:space="preserve">-0.02</w:t>
+                  </w:r>
+                </w:p>
+              </w:tc>
             </w:tr>
             <w:tr>
               <w:trPr>
@@ -7044,6 +7161,60 @@
                   </w:r>
                 </w:p>
               </w:tc>
+              <w:tc>
+                <w:tcPr>
+                  <w:tcBorders>
+                    <w:bottom w:val="none" w:sz="0" w:space="0" w:color="000000"/>
+                    <w:top w:val="none" w:sz="0" w:space="0" w:color="000000"/>
+                    <w:left w:val="none" w:sz="0" w:space="0" w:color="000000"/>
+                    <w:right w:val="none" w:sz="0" w:space="0" w:color="000000"/>
+                  </w:tcBorders>
+                  <w:shd w:val="clear" w:color="auto" w:fill="F8F2F0"/>
+                  <w:tcMar>
+                    <w:top w:w="0" w:type="dxa"/>
+                    <w:bottom w:w="0" w:type="dxa"/>
+                    <w:left w:w="0" w:type="dxa"/>
+                    <w:right w:w="0" w:type="dxa"/>
+                  </w:tcMar>
+                  <w:vAlign w:val="center"/>
+                </w:tcPr>
+                <w:p>
+                  <w:pPr>
+                    <w:jc w:val="center"/>
+                    <w:pBdr>
+                      <w:bottom w:val="none" w:sz="0" w:space="0" w:color="000000"/>
+                      <w:top w:val="none" w:sz="0" w:space="0" w:color="000000"/>
+                      <w:left w:val="none" w:sz="0" w:space="0" w:color="000000"/>
+                      <w:right w:val="none" w:sz="0" w:space="0" w:color="000000"/>
+                    </w:pBdr>
+                    <w:spacing w:after="100" w:before="100" w:line="240"/>
+                    <w:ind w:left="100" w:right="100" w:firstLine="0" w:firstLineChars="0"/>
+                    <w:rPr>
+                      <w:rFonts w:ascii="Arial" w:hAnsi="Arial" w:eastAsia="Arial" w:cs="Arial"/>
+                      <w:i w:val="false"/>
+                      <w:b w:val="false"/>
+                      <w:u w:val="none"/>
+                      <w:strike w:val="false"/>
+                      <w:sz w:val="20"/>
+                      <w:szCs w:val="20"/>
+                      <w:color w:val="000000"/>
+                    </w:rPr>
+                  </w:pPr>
+                  <w:r xmlns:w="http://schemas.openxmlformats.org/wordprocessingml/2006/main" xmlns:wp="http://schemas.openxmlformats.org/drawingml/2006/wordprocessingDrawing" xmlns:r="http://schemas.openxmlformats.org/officeDocument/2006/relationships" xmlns:w14="http://schemas.microsoft.com/office/word/2010/wordml">
+                    <w:rPr>
+                      <w:rFonts w:ascii="Arial" w:hAnsi="Arial" w:eastAsia="Arial" w:cs="Arial"/>
+                      <w:i w:val="false"/>
+                      <w:b w:val="false"/>
+                      <w:u w:val="none"/>
+                      <w:strike w:val="false"/>
+                      <w:sz w:val="20"/>
+                      <w:szCs w:val="20"/>
+                      <w:color w:val="000000"/>
+                    </w:rPr>
+                    <w:t xml:space="preserve">0.01</w:t>
+                  </w:r>
+                </w:p>
+              </w:tc>
             </w:tr>
             <w:tr>
               <w:trPr>
@@ -7469,6 +7640,60 @@
                   </w:r>
                 </w:p>
               </w:tc>
+              <w:tc>
+                <w:tcPr>
+                  <w:tcBorders>
+                    <w:bottom w:val="none" w:sz="0" w:space="0" w:color="000000"/>
+                    <w:top w:val="none" w:sz="0" w:space="0" w:color="000000"/>
+                    <w:left w:val="none" w:sz="0" w:space="0" w:color="000000"/>
+                    <w:right w:val="none" w:sz="0" w:space="0" w:color="000000"/>
+                  </w:tcBorders>
+                  <w:shd w:val="clear" w:color="auto" w:fill="F7F4F4"/>
+                  <w:tcMar>
+                    <w:top w:w="0" w:type="dxa"/>
+                    <w:bottom w:w="0" w:type="dxa"/>
+                    <w:left w:w="0" w:type="dxa"/>
+                    <w:right w:w="0" w:type="dxa"/>
+                  </w:tcMar>
+                  <w:vAlign w:val="center"/>
+                </w:tcPr>
+                <w:p>
+                  <w:pPr>
+                    <w:jc w:val="center"/>
+                    <w:pBdr>
+                      <w:bottom w:val="none" w:sz="0" w:space="0" w:color="000000"/>
+                      <w:top w:val="none" w:sz="0" w:space="0" w:color="000000"/>
+                      <w:left w:val="none" w:sz="0" w:space="0" w:color="000000"/>
+                      <w:right w:val="none" w:sz="0" w:space="0" w:color="000000"/>
+                    </w:pBdr>
+                    <w:spacing w:after="100" w:before="100" w:line="240"/>
+                    <w:ind w:left="100" w:right="100" w:firstLine="0" w:firstLineChars="0"/>
+                    <w:rPr>
+                      <w:rFonts w:ascii="Arial" w:hAnsi="Arial" w:eastAsia="Arial" w:cs="Arial"/>
+                      <w:i w:val="false"/>
+                      <w:b w:val="false"/>
+                      <w:u w:val="none"/>
+                      <w:strike w:val="false"/>
+                      <w:sz w:val="20"/>
+                      <w:szCs w:val="20"/>
+                      <w:color w:val="000000"/>
+                    </w:rPr>
+                  </w:pPr>
+                  <w:r xmlns:w="http://schemas.openxmlformats.org/wordprocessingml/2006/main" xmlns:wp="http://schemas.openxmlformats.org/drawingml/2006/wordprocessingDrawing" xmlns:r="http://schemas.openxmlformats.org/officeDocument/2006/relationships" xmlns:w14="http://schemas.microsoft.com/office/word/2010/wordml">
+                    <w:rPr>
+                      <w:rFonts w:ascii="Arial" w:hAnsi="Arial" w:eastAsia="Arial" w:cs="Arial"/>
+                      <w:i w:val="false"/>
+                      <w:b w:val="false"/>
+                      <w:u w:val="none"/>
+                      <w:strike w:val="false"/>
+                      <w:sz w:val="20"/>
+                      <w:szCs w:val="20"/>
+                      <w:color w:val="000000"/>
+                    </w:rPr>
+                    <w:t xml:space="preserve">0.00</w:t>
+                  </w:r>
+                </w:p>
+              </w:tc>
             </w:tr>
             <w:tr>
               <w:trPr>
@@ -7907,6 +8132,60 @@
                   </w:r>
                 </w:p>
               </w:tc>
+              <w:tc>
+                <w:tcPr>
+                  <w:tcBorders>
+                    <w:bottom w:val="none" w:sz="0" w:space="0" w:color="000000"/>
+                    <w:top w:val="none" w:sz="0" w:space="0" w:color="000000"/>
+                    <w:left w:val="none" w:sz="0" w:space="0" w:color="000000"/>
+                    <w:right w:val="none" w:sz="0" w:space="0" w:color="000000"/>
+                  </w:tcBorders>
+                  <w:shd w:val="clear" w:color="auto" w:fill="FAD1C9"/>
+                  <w:tcMar>
+                    <w:top w:w="0" w:type="dxa"/>
+                    <w:bottom w:w="0" w:type="dxa"/>
+                    <w:left w:w="0" w:type="dxa"/>
+                    <w:right w:w="0" w:type="dxa"/>
+                  </w:tcMar>
+                  <w:vAlign w:val="center"/>
+                </w:tcPr>
+                <w:p>
+                  <w:pPr>
+                    <w:jc w:val="center"/>
+                    <w:pBdr>
+                      <w:bottom w:val="none" w:sz="0" w:space="0" w:color="000000"/>
+                      <w:top w:val="none" w:sz="0" w:space="0" w:color="000000"/>
+                      <w:left w:val="none" w:sz="0" w:space="0" w:color="000000"/>
+                      <w:right w:val="none" w:sz="0" w:space="0" w:color="000000"/>
+                    </w:pBdr>
+                    <w:spacing w:after="100" w:before="100" w:line="240"/>
+                    <w:ind w:left="100" w:right="100" w:firstLine="0" w:firstLineChars="0"/>
+                    <w:rPr>
+                      <w:rFonts w:ascii="Arial" w:hAnsi="Arial" w:eastAsia="Arial" w:cs="Arial"/>
+                      <w:i w:val="false"/>
+                      <w:b w:val="false"/>
+                      <w:u w:val="none"/>
+                      <w:strike w:val="false"/>
+                      <w:sz w:val="20"/>
+                      <w:szCs w:val="20"/>
+                      <w:color w:val="000000"/>
+                    </w:rPr>
+                  </w:pPr>
+                  <w:r xmlns:w="http://schemas.openxmlformats.org/wordprocessingml/2006/main" xmlns:wp="http://schemas.openxmlformats.org/drawingml/2006/wordprocessingDrawing" xmlns:r="http://schemas.openxmlformats.org/officeDocument/2006/relationships" xmlns:w14="http://schemas.microsoft.com/office/word/2010/wordml">
+                    <w:rPr>
+                      <w:rFonts w:ascii="Arial" w:hAnsi="Arial" w:eastAsia="Arial" w:cs="Arial"/>
+                      <w:i w:val="false"/>
+                      <w:b w:val="false"/>
+                      <w:u w:val="none"/>
+                      <w:strike w:val="false"/>
+                      <w:sz w:val="20"/>
+                      <w:szCs w:val="20"/>
+                      <w:color w:val="000000"/>
+                    </w:rPr>
+                    <w:t xml:space="preserve">0.38</w:t>
+                  </w:r>
+                </w:p>
+              </w:tc>
             </w:tr>
             <w:tr>
               <w:trPr>
@@ -8332,6 +8611,60 @@
                   </w:r>
                 </w:p>
               </w:tc>
+              <w:tc>
+                <w:tcPr>
+                  <w:tcBorders>
+                    <w:bottom w:val="none" w:sz="0" w:space="0" w:color="000000"/>
+                    <w:top w:val="none" w:sz="0" w:space="0" w:color="000000"/>
+                    <w:left w:val="none" w:sz="0" w:space="0" w:color="000000"/>
+                    <w:right w:val="none" w:sz="0" w:space="0" w:color="000000"/>
+                  </w:tcBorders>
+                  <w:shd w:val="clear" w:color="auto" w:fill="E5604D"/>
+                  <w:tcMar>
+                    <w:top w:w="0" w:type="dxa"/>
+                    <w:bottom w:w="0" w:type="dxa"/>
+                    <w:left w:w="0" w:type="dxa"/>
+                    <w:right w:w="0" w:type="dxa"/>
+                  </w:tcMar>
+                  <w:vAlign w:val="center"/>
+                </w:tcPr>
+                <w:p>
+                  <w:pPr>
+                    <w:jc w:val="center"/>
+                    <w:pBdr>
+                      <w:bottom w:val="none" w:sz="0" w:space="0" w:color="000000"/>
+                      <w:top w:val="none" w:sz="0" w:space="0" w:color="000000"/>
+                      <w:left w:val="none" w:sz="0" w:space="0" w:color="000000"/>
+                      <w:right w:val="none" w:sz="0" w:space="0" w:color="000000"/>
+                    </w:pBdr>
+                    <w:spacing w:after="100" w:before="100" w:line="240"/>
+                    <w:ind w:left="100" w:right="100" w:firstLine="0" w:firstLineChars="0"/>
+                    <w:rPr>
+                      <w:rFonts w:ascii="Arial" w:hAnsi="Arial" w:eastAsia="Arial" w:cs="Arial"/>
+                      <w:i w:val="false"/>
+                      <w:b w:val="false"/>
+                      <w:u w:val="none"/>
+                      <w:strike w:val="false"/>
+                      <w:sz w:val="20"/>
+                      <w:szCs w:val="20"/>
+                      <w:color w:val="000000"/>
+                    </w:rPr>
+                  </w:pPr>
+                  <w:r xmlns:w="http://schemas.openxmlformats.org/wordprocessingml/2006/main" xmlns:wp="http://schemas.openxmlformats.org/drawingml/2006/wordprocessingDrawing" xmlns:r="http://schemas.openxmlformats.org/officeDocument/2006/relationships" xmlns:w14="http://schemas.microsoft.com/office/word/2010/wordml">
+                    <w:rPr>
+                      <w:rFonts w:ascii="Arial" w:hAnsi="Arial" w:eastAsia="Arial" w:cs="Arial"/>
+                      <w:i w:val="false"/>
+                      <w:b w:val="false"/>
+                      <w:u w:val="none"/>
+                      <w:strike w:val="false"/>
+                      <w:sz w:val="20"/>
+                      <w:szCs w:val="20"/>
+                      <w:color w:val="000000"/>
+                    </w:rPr>
+                    <w:t xml:space="preserve">1.49</w:t>
+                  </w:r>
+                </w:p>
+              </w:tc>
             </w:tr>
             <w:tr>
               <w:trPr>
@@ -8757,6 +9090,60 @@
                   </w:r>
                 </w:p>
               </w:tc>
+              <w:tc>
+                <w:tcPr>
+                  <w:tcBorders>
+                    <w:bottom w:val="none" w:sz="0" w:space="0" w:color="000000"/>
+                    <w:top w:val="none" w:sz="0" w:space="0" w:color="000000"/>
+                    <w:left w:val="none" w:sz="0" w:space="0" w:color="000000"/>
+                    <w:right w:val="none" w:sz="0" w:space="0" w:color="000000"/>
+                  </w:tcBorders>
+                  <w:shd w:val="clear" w:color="auto" w:fill="FAD2CA"/>
+                  <w:tcMar>
+                    <w:top w:w="0" w:type="dxa"/>
+                    <w:bottom w:w="0" w:type="dxa"/>
+                    <w:left w:w="0" w:type="dxa"/>
+                    <w:right w:w="0" w:type="dxa"/>
+                  </w:tcMar>
+                  <w:vAlign w:val="center"/>
+                </w:tcPr>
+                <w:p>
+                  <w:pPr>
+                    <w:jc w:val="center"/>
+                    <w:pBdr>
+                      <w:bottom w:val="none" w:sz="0" w:space="0" w:color="000000"/>
+                      <w:top w:val="none" w:sz="0" w:space="0" w:color="000000"/>
+                      <w:left w:val="none" w:sz="0" w:space="0" w:color="000000"/>
+                      <w:right w:val="none" w:sz="0" w:space="0" w:color="000000"/>
+                    </w:pBdr>
+                    <w:spacing w:after="100" w:before="100" w:line="240"/>
+                    <w:ind w:left="100" w:right="100" w:firstLine="0" w:firstLineChars="0"/>
+                    <w:rPr>
+                      <w:rFonts w:ascii="Arial" w:hAnsi="Arial" w:eastAsia="Arial" w:cs="Arial"/>
+                      <w:i w:val="false"/>
+                      <w:b w:val="false"/>
+                      <w:u w:val="none"/>
+                      <w:strike w:val="false"/>
+                      <w:sz w:val="20"/>
+                      <w:szCs w:val="20"/>
+                      <w:color w:val="000000"/>
+                    </w:rPr>
+                  </w:pPr>
+                  <w:r xmlns:w="http://schemas.openxmlformats.org/wordprocessingml/2006/main" xmlns:wp="http://schemas.openxmlformats.org/drawingml/2006/wordprocessingDrawing" xmlns:r="http://schemas.openxmlformats.org/officeDocument/2006/relationships" xmlns:w14="http://schemas.microsoft.com/office/word/2010/wordml">
+                    <w:rPr>
+                      <w:rFonts w:ascii="Arial" w:hAnsi="Arial" w:eastAsia="Arial" w:cs="Arial"/>
+                      <w:i w:val="false"/>
+                      <w:b w:val="false"/>
+                      <w:u w:val="none"/>
+                      <w:strike w:val="false"/>
+                      <w:sz w:val="20"/>
+                      <w:szCs w:val="20"/>
+                      <w:color w:val="000000"/>
+                    </w:rPr>
+                    <w:t xml:space="preserve">0.37</w:t>
+                  </w:r>
+                </w:p>
+              </w:tc>
             </w:tr>
             <w:tr>
               <w:trPr>
@@ -9195,6 +9582,60 @@
                   </w:r>
                 </w:p>
               </w:tc>
+              <w:tc>
+                <w:tcPr>
+                  <w:tcBorders>
+                    <w:bottom w:val="none" w:sz="0" w:space="0" w:color="000000"/>
+                    <w:top w:val="none" w:sz="0" w:space="0" w:color="000000"/>
+                    <w:left w:val="none" w:sz="0" w:space="0" w:color="000000"/>
+                    <w:right w:val="none" w:sz="0" w:space="0" w:color="000000"/>
+                  </w:tcBorders>
+                  <w:shd w:val="clear" w:color="auto" w:fill="F8B0A2"/>
+                  <w:tcMar>
+                    <w:top w:w="0" w:type="dxa"/>
+                    <w:bottom w:w="0" w:type="dxa"/>
+                    <w:left w:w="0" w:type="dxa"/>
+                    <w:right w:w="0" w:type="dxa"/>
+                  </w:tcMar>
+                  <w:vAlign w:val="center"/>
+                </w:tcPr>
+                <w:p>
+                  <w:pPr>
+                    <w:jc w:val="center"/>
+                    <w:pBdr>
+                      <w:bottom w:val="none" w:sz="0" w:space="0" w:color="000000"/>
+                      <w:top w:val="none" w:sz="0" w:space="0" w:color="000000"/>
+                      <w:left w:val="none" w:sz="0" w:space="0" w:color="000000"/>
+                      <w:right w:val="none" w:sz="0" w:space="0" w:color="000000"/>
+                    </w:pBdr>
+                    <w:spacing w:after="100" w:before="100" w:line="240"/>
+                    <w:ind w:left="100" w:right="100" w:firstLine="0" w:firstLineChars="0"/>
+                    <w:rPr>
+                      <w:rFonts w:ascii="Arial" w:hAnsi="Arial" w:eastAsia="Arial" w:cs="Arial"/>
+                      <w:i w:val="false"/>
+                      <w:b w:val="false"/>
+                      <w:u w:val="none"/>
+                      <w:strike w:val="false"/>
+                      <w:sz w:val="20"/>
+                      <w:szCs w:val="20"/>
+                      <w:color w:val="000000"/>
+                    </w:rPr>
+                  </w:pPr>
+                  <w:r xmlns:w="http://schemas.openxmlformats.org/wordprocessingml/2006/main" xmlns:wp="http://schemas.openxmlformats.org/drawingml/2006/wordprocessingDrawing" xmlns:r="http://schemas.openxmlformats.org/officeDocument/2006/relationships" xmlns:w14="http://schemas.microsoft.com/office/word/2010/wordml">
+                    <w:rPr>
+                      <w:rFonts w:ascii="Arial" w:hAnsi="Arial" w:eastAsia="Arial" w:cs="Arial"/>
+                      <w:i w:val="false"/>
+                      <w:b w:val="false"/>
+                      <w:u w:val="none"/>
+                      <w:strike w:val="false"/>
+                      <w:sz w:val="20"/>
+                      <w:szCs w:val="20"/>
+                      <w:color w:val="000000"/>
+                    </w:rPr>
+                    <w:t xml:space="preserve">0.09</w:t>
+                  </w:r>
+                </w:p>
+              </w:tc>
             </w:tr>
             <w:tr>
               <w:trPr>
@@ -9620,6 +10061,60 @@
                   </w:r>
                 </w:p>
               </w:tc>
+              <w:tc>
+                <w:tcPr>
+                  <w:tcBorders>
+                    <w:bottom w:val="none" w:sz="0" w:space="0" w:color="000000"/>
+                    <w:top w:val="none" w:sz="0" w:space="0" w:color="000000"/>
+                    <w:left w:val="none" w:sz="0" w:space="0" w:color="000000"/>
+                    <w:right w:val="none" w:sz="0" w:space="0" w:color="000000"/>
+                  </w:tcBorders>
+                  <w:shd w:val="clear" w:color="auto" w:fill="DF4B3A"/>
+                  <w:tcMar>
+                    <w:top w:w="0" w:type="dxa"/>
+                    <w:bottom w:w="0" w:type="dxa"/>
+                    <w:left w:w="0" w:type="dxa"/>
+                    <w:right w:w="0" w:type="dxa"/>
+                  </w:tcMar>
+                  <w:vAlign w:val="center"/>
+                </w:tcPr>
+                <w:p>
+                  <w:pPr>
+                    <w:jc w:val="center"/>
+                    <w:pBdr>
+                      <w:bottom w:val="none" w:sz="0" w:space="0" w:color="000000"/>
+                      <w:top w:val="none" w:sz="0" w:space="0" w:color="000000"/>
+                      <w:left w:val="none" w:sz="0" w:space="0" w:color="000000"/>
+                      <w:right w:val="none" w:sz="0" w:space="0" w:color="000000"/>
+                    </w:pBdr>
+                    <w:spacing w:after="100" w:before="100" w:line="240"/>
+                    <w:ind w:left="100" w:right="100" w:firstLine="0" w:firstLineChars="0"/>
+                    <w:rPr>
+                      <w:rFonts w:ascii="Arial" w:hAnsi="Arial" w:eastAsia="Arial" w:cs="Arial"/>
+                      <w:i w:val="false"/>
+                      <w:b w:val="false"/>
+                      <w:u w:val="none"/>
+                      <w:strike w:val="false"/>
+                      <w:sz w:val="20"/>
+                      <w:szCs w:val="20"/>
+                      <w:color w:val="000000"/>
+                    </w:rPr>
+                  </w:pPr>
+                  <w:r xmlns:w="http://schemas.openxmlformats.org/wordprocessingml/2006/main" xmlns:wp="http://schemas.openxmlformats.org/drawingml/2006/wordprocessingDrawing" xmlns:r="http://schemas.openxmlformats.org/officeDocument/2006/relationships" xmlns:w14="http://schemas.microsoft.com/office/word/2010/wordml">
+                    <w:rPr>
+                      <w:rFonts w:ascii="Arial" w:hAnsi="Arial" w:eastAsia="Arial" w:cs="Arial"/>
+                      <w:i w:val="false"/>
+                      <w:b w:val="false"/>
+                      <w:u w:val="none"/>
+                      <w:strike w:val="false"/>
+                      <w:sz w:val="20"/>
+                      <w:szCs w:val="20"/>
+                      <w:color w:val="000000"/>
+                    </w:rPr>
+                    <w:t xml:space="preserve">0.20</w:t>
+                  </w:r>
+                </w:p>
+              </w:tc>
             </w:tr>
             <w:tr>
               <w:trPr>
@@ -10042,6 +10537,60 @@
                       <w:color w:val="000000"/>
                     </w:rPr>
                     <w:t xml:space="preserve">0.07</w:t>
+                  </w:r>
+                </w:p>
+              </w:tc>
+              <w:tc>
+                <w:tcPr>
+                  <w:tcBorders>
+                    <w:bottom w:val="single" w:sz="12" w:space="0" w:color="666666"/>
+                    <w:top w:val="none" w:sz="0" w:space="0" w:color="000000"/>
+                    <w:left w:val="none" w:sz="0" w:space="0" w:color="000000"/>
+                    <w:right w:val="none" w:sz="0" w:space="0" w:color="000000"/>
+                  </w:tcBorders>
+                  <w:shd w:val="clear" w:color="auto" w:fill="B2D6B9"/>
+                  <w:tcMar>
+                    <w:top w:w="0" w:type="dxa"/>
+                    <w:bottom w:w="0" w:type="dxa"/>
+                    <w:left w:w="0" w:type="dxa"/>
+                    <w:right w:w="0" w:type="dxa"/>
+                  </w:tcMar>
+                  <w:vAlign w:val="center"/>
+                </w:tcPr>
+                <w:p>
+                  <w:pPr>
+                    <w:jc w:val="center"/>
+                    <w:pBdr>
+                      <w:bottom w:val="none" w:sz="0" w:space="0" w:color="000000"/>
+                      <w:top w:val="none" w:sz="0" w:space="0" w:color="000000"/>
+                      <w:left w:val="none" w:sz="0" w:space="0" w:color="000000"/>
+                      <w:right w:val="none" w:sz="0" w:space="0" w:color="000000"/>
+                    </w:pBdr>
+                    <w:spacing w:after="100" w:before="100" w:line="240"/>
+                    <w:ind w:left="100" w:right="100" w:firstLine="0" w:firstLineChars="0"/>
+                    <w:rPr>
+                      <w:rFonts w:ascii="Arial" w:hAnsi="Arial" w:eastAsia="Arial" w:cs="Arial"/>
+                      <w:i w:val="false"/>
+                      <w:b w:val="false"/>
+                      <w:u w:val="none"/>
+                      <w:strike w:val="false"/>
+                      <w:sz w:val="20"/>
+                      <w:szCs w:val="20"/>
+                      <w:color w:val="000000"/>
+                    </w:rPr>
+                  </w:pPr>
+                  <w:r xmlns:w="http://schemas.openxmlformats.org/wordprocessingml/2006/main" xmlns:wp="http://schemas.openxmlformats.org/drawingml/2006/wordprocessingDrawing" xmlns:r="http://schemas.openxmlformats.org/officeDocument/2006/relationships" xmlns:w14="http://schemas.microsoft.com/office/word/2010/wordml">
+                    <w:rPr>
+                      <w:rFonts w:ascii="Arial" w:hAnsi="Arial" w:eastAsia="Arial" w:cs="Arial"/>
+                      <w:i w:val="false"/>
+                      <w:b w:val="false"/>
+                      <w:u w:val="none"/>
+                      <w:strike w:val="false"/>
+                      <w:sz w:val="20"/>
+                      <w:szCs w:val="20"/>
+                      <w:color w:val="000000"/>
+                    </w:rPr>
+                    <w:t xml:space="preserve">-0.08</w:t>
                   </w:r>
                 </w:p>
               </w:tc>

</xml_diff>